<commit_message>
Add day-by-day pré/pós tables per variable to the pre-season week article
Section 4.5 now includes four per-variable tables (Tables 5-8: Vigor, Fadiga
BRUMS, Fadiga física, Fadiga mental) giving the pré and pós means, delta, paired
dz and Wilcoxon p for each day (D1-D7), with significance flagged. Downstream
tables renumbered to 9-12. The document now has 12 tables and 9 figures.

Reproducible: scripts/analise/build_semana_docx.py. Athletes anonymized; no raw
data committed.

Co-Authored-By: Claude Opus 4.8 <noreply@anthropic.com>
Claude-Session: https://claude.ai/code/session_01P7yGiDeoGDyjWvPWQVsUrj
</commit_message>
<xml_diff>
--- a/Artigos/Perfil_Humor_Semana_PreTemporada_ABNT.docx
+++ b/Artigos/Perfil_Humor_Semana_PreTemporada_ABNT.docx
@@ -3012,7 +3012,3355 @@
           <w:i w:val="0"/>
           <w:sz w:val="24"/>
         </w:rPr>
-        <w:t>Dentro dos dias, do primeiro ao último registro, o vigor caiu e a fadiga (física, do BRUMS e mental) aumentou, todos de forma significativa — a fadiga física com o maior efeito agudo (dz = +1,08). Esse padrão, de mesma direção que o observado na escala semanal, indica que a resposta aguda a cada dia é um análogo, em menor amplitude, do processo de acúmulo. A Figura 3 detalha a resposta pré→pós por dia, evidenciando que o contraste se mantém ao longo de toda a semana.</w:t>
+        <w:t>Dentro dos dias, do primeiro ao último registro, o vigor caiu e a fadiga (física, do BRUMS e mental) aumentou, todos de forma significativa — a fadiga física com o maior efeito agudo (dz = +1,08). Esse padrão, de mesma direção que o observado na escala semanal, indica que a resposta aguda a cada dia é um análogo, em menor amplitude, do processo de acúmulo. As Tabelas 5 a 8 detalham a resposta pré→pós dia a dia para cada variável, e a Figura 3 a representa graficamente.</w:t>
+      </w:r>
+    </w:p>
+    <w:p>
+      <w:pPr>
+        <w:spacing w:before="160" w:line="240" w:lineRule="auto"/>
+        <w:jc w:val="left"/>
+      </w:pPr>
+      <w:r>
+        <w:rPr>
+          <w:rFonts w:ascii="Times New Roman" w:hAnsi="Times New Roman"/>
+          <w:b w:val="0"/>
+          <w:i w:val="0"/>
+          <w:sz w:val="20"/>
+        </w:rPr>
+        <w:t>Tabela 5 – Vigor: resposta pré→pós por dia (* p &lt; 0,05)</w:t>
+      </w:r>
+    </w:p>
+    <w:tbl>
+      <w:tblPr>
+        <w:tblW w:type="auto" w:w="0"/>
+        <w:jc w:val="center"/>
+        <w:tblLook w:firstColumn="1" w:firstRow="1" w:lastColumn="0" w:lastRow="0" w:noHBand="0" w:noVBand="1" w:val="04A0"/>
+        <w:tblBorders>
+          <w:top w:val="single" w:sz="6" w:space="0" w:color="000000"/>
+          <w:bottom w:val="single" w:sz="6" w:space="0" w:color="000000"/>
+          <w:insideH w:val="single" w:sz="6" w:space="0" w:color="000000"/>
+          <w:left w:val="none"/>
+          <w:right w:val="none"/>
+          <w:insideV w:val="none"/>
+        </w:tblBorders>
+      </w:tblPr>
+      <w:tblGrid>
+        <w:gridCol w:w="1567"/>
+        <w:gridCol w:w="1567"/>
+        <w:gridCol w:w="1567"/>
+        <w:gridCol w:w="1567"/>
+        <w:gridCol w:w="1567"/>
+        <w:gridCol w:w="1567"/>
+      </w:tblGrid>
+      <w:tr>
+        <w:tc>
+          <w:tcPr>
+            <w:tcW w:type="dxa" w:w="1567"/>
+          </w:tcPr>
+          <w:p>
+            <w:r>
+              <w:rPr>
+                <w:rFonts w:ascii="Times New Roman" w:hAnsi="Times New Roman"/>
+                <w:b/>
+                <w:i w:val="0"/>
+                <w:sz w:val="18"/>
+              </w:rPr>
+              <w:t>Dia</w:t>
+            </w:r>
+          </w:p>
+        </w:tc>
+        <w:tc>
+          <w:tcPr>
+            <w:tcW w:type="dxa" w:w="1567"/>
+          </w:tcPr>
+          <w:p>
+            <w:r>
+              <w:rPr>
+                <w:rFonts w:ascii="Times New Roman" w:hAnsi="Times New Roman"/>
+                <w:b/>
+                <w:i w:val="0"/>
+                <w:sz w:val="18"/>
+              </w:rPr>
+              <w:t>Pré</w:t>
+            </w:r>
+          </w:p>
+        </w:tc>
+        <w:tc>
+          <w:tcPr>
+            <w:tcW w:type="dxa" w:w="1567"/>
+          </w:tcPr>
+          <w:p>
+            <w:r>
+              <w:rPr>
+                <w:rFonts w:ascii="Times New Roman" w:hAnsi="Times New Roman"/>
+                <w:b/>
+                <w:i w:val="0"/>
+                <w:sz w:val="18"/>
+              </w:rPr>
+              <w:t>Pós</w:t>
+            </w:r>
+          </w:p>
+        </w:tc>
+        <w:tc>
+          <w:tcPr>
+            <w:tcW w:type="dxa" w:w="1567"/>
+          </w:tcPr>
+          <w:p>
+            <w:r>
+              <w:rPr>
+                <w:rFonts w:ascii="Times New Roman" w:hAnsi="Times New Roman"/>
+                <w:b/>
+                <w:i w:val="0"/>
+                <w:sz w:val="18"/>
+              </w:rPr>
+              <w:t>Δ (pós−pré)</w:t>
+            </w:r>
+          </w:p>
+        </w:tc>
+        <w:tc>
+          <w:tcPr>
+            <w:tcW w:type="dxa" w:w="1567"/>
+          </w:tcPr>
+          <w:p>
+            <w:r>
+              <w:rPr>
+                <w:rFonts w:ascii="Times New Roman" w:hAnsi="Times New Roman"/>
+                <w:b/>
+                <w:i w:val="0"/>
+                <w:sz w:val="18"/>
+              </w:rPr>
+              <w:t>dz</w:t>
+            </w:r>
+          </w:p>
+        </w:tc>
+        <w:tc>
+          <w:tcPr>
+            <w:tcW w:type="dxa" w:w="1567"/>
+          </w:tcPr>
+          <w:p>
+            <w:r>
+              <w:rPr>
+                <w:rFonts w:ascii="Times New Roman" w:hAnsi="Times New Roman"/>
+                <w:b/>
+                <w:i w:val="0"/>
+                <w:sz w:val="18"/>
+              </w:rPr>
+              <w:t>p</w:t>
+            </w:r>
+          </w:p>
+        </w:tc>
+      </w:tr>
+      <w:tr>
+        <w:tc>
+          <w:tcPr>
+            <w:tcW w:type="dxa" w:w="1567"/>
+          </w:tcPr>
+          <w:p>
+            <w:r>
+              <w:rPr>
+                <w:rFonts w:ascii="Times New Roman" w:hAnsi="Times New Roman"/>
+                <w:b w:val="0"/>
+                <w:i w:val="0"/>
+                <w:sz w:val="18"/>
+              </w:rPr>
+              <w:t>Dia 1</w:t>
+            </w:r>
+          </w:p>
+        </w:tc>
+        <w:tc>
+          <w:tcPr>
+            <w:tcW w:type="dxa" w:w="1567"/>
+          </w:tcPr>
+          <w:p>
+            <w:r>
+              <w:rPr>
+                <w:rFonts w:ascii="Times New Roman" w:hAnsi="Times New Roman"/>
+                <w:b w:val="0"/>
+                <w:i w:val="0"/>
+                <w:sz w:val="18"/>
+              </w:rPr>
+              <w:t>8,60</w:t>
+            </w:r>
+          </w:p>
+        </w:tc>
+        <w:tc>
+          <w:tcPr>
+            <w:tcW w:type="dxa" w:w="1567"/>
+          </w:tcPr>
+          <w:p>
+            <w:r>
+              <w:rPr>
+                <w:rFonts w:ascii="Times New Roman" w:hAnsi="Times New Roman"/>
+                <w:b w:val="0"/>
+                <w:i w:val="0"/>
+                <w:sz w:val="18"/>
+              </w:rPr>
+              <w:t>6,13</w:t>
+            </w:r>
+          </w:p>
+        </w:tc>
+        <w:tc>
+          <w:tcPr>
+            <w:tcW w:type="dxa" w:w="1567"/>
+          </w:tcPr>
+          <w:p>
+            <w:r>
+              <w:rPr>
+                <w:rFonts w:ascii="Times New Roman" w:hAnsi="Times New Roman"/>
+                <w:b w:val="0"/>
+                <w:i w:val="0"/>
+                <w:sz w:val="18"/>
+              </w:rPr>
+              <w:t>-2,47</w:t>
+            </w:r>
+          </w:p>
+        </w:tc>
+        <w:tc>
+          <w:tcPr>
+            <w:tcW w:type="dxa" w:w="1567"/>
+          </w:tcPr>
+          <w:p>
+            <w:r>
+              <w:rPr>
+                <w:rFonts w:ascii="Times New Roman" w:hAnsi="Times New Roman"/>
+                <w:b w:val="0"/>
+                <w:i w:val="0"/>
+                <w:sz w:val="18"/>
+              </w:rPr>
+              <w:t>-1,00</w:t>
+            </w:r>
+          </w:p>
+        </w:tc>
+        <w:tc>
+          <w:tcPr>
+            <w:tcW w:type="dxa" w:w="1567"/>
+          </w:tcPr>
+          <w:p>
+            <w:r>
+              <w:rPr>
+                <w:rFonts w:ascii="Times New Roman" w:hAnsi="Times New Roman"/>
+                <w:b w:val="0"/>
+                <w:i w:val="0"/>
+                <w:sz w:val="18"/>
+              </w:rPr>
+              <w:t>0,006*</w:t>
+            </w:r>
+          </w:p>
+        </w:tc>
+      </w:tr>
+      <w:tr>
+        <w:tc>
+          <w:tcPr>
+            <w:tcW w:type="dxa" w:w="1567"/>
+          </w:tcPr>
+          <w:p>
+            <w:r>
+              <w:rPr>
+                <w:rFonts w:ascii="Times New Roman" w:hAnsi="Times New Roman"/>
+                <w:b w:val="0"/>
+                <w:i w:val="0"/>
+                <w:sz w:val="18"/>
+              </w:rPr>
+              <w:t>Dia 2</w:t>
+            </w:r>
+          </w:p>
+        </w:tc>
+        <w:tc>
+          <w:tcPr>
+            <w:tcW w:type="dxa" w:w="1567"/>
+          </w:tcPr>
+          <w:p>
+            <w:r>
+              <w:rPr>
+                <w:rFonts w:ascii="Times New Roman" w:hAnsi="Times New Roman"/>
+                <w:b w:val="0"/>
+                <w:i w:val="0"/>
+                <w:sz w:val="18"/>
+              </w:rPr>
+              <w:t>6,00</w:t>
+            </w:r>
+          </w:p>
+        </w:tc>
+        <w:tc>
+          <w:tcPr>
+            <w:tcW w:type="dxa" w:w="1567"/>
+          </w:tcPr>
+          <w:p>
+            <w:r>
+              <w:rPr>
+                <w:rFonts w:ascii="Times New Roman" w:hAnsi="Times New Roman"/>
+                <w:b w:val="0"/>
+                <w:i w:val="0"/>
+                <w:sz w:val="18"/>
+              </w:rPr>
+              <w:t>4,73</w:t>
+            </w:r>
+          </w:p>
+        </w:tc>
+        <w:tc>
+          <w:tcPr>
+            <w:tcW w:type="dxa" w:w="1567"/>
+          </w:tcPr>
+          <w:p>
+            <w:r>
+              <w:rPr>
+                <w:rFonts w:ascii="Times New Roman" w:hAnsi="Times New Roman"/>
+                <w:b w:val="0"/>
+                <w:i w:val="0"/>
+                <w:sz w:val="18"/>
+              </w:rPr>
+              <w:t>-1,27</w:t>
+            </w:r>
+          </w:p>
+        </w:tc>
+        <w:tc>
+          <w:tcPr>
+            <w:tcW w:type="dxa" w:w="1567"/>
+          </w:tcPr>
+          <w:p>
+            <w:r>
+              <w:rPr>
+                <w:rFonts w:ascii="Times New Roman" w:hAnsi="Times New Roman"/>
+                <w:b w:val="0"/>
+                <w:i w:val="0"/>
+                <w:sz w:val="18"/>
+              </w:rPr>
+              <w:t>-0,39</w:t>
+            </w:r>
+          </w:p>
+        </w:tc>
+        <w:tc>
+          <w:tcPr>
+            <w:tcW w:type="dxa" w:w="1567"/>
+          </w:tcPr>
+          <w:p>
+            <w:r>
+              <w:rPr>
+                <w:rFonts w:ascii="Times New Roman" w:hAnsi="Times New Roman"/>
+                <w:b w:val="0"/>
+                <w:i w:val="0"/>
+                <w:sz w:val="18"/>
+              </w:rPr>
+              <w:t>0,091</w:t>
+            </w:r>
+          </w:p>
+        </w:tc>
+      </w:tr>
+      <w:tr>
+        <w:tc>
+          <w:tcPr>
+            <w:tcW w:type="dxa" w:w="1567"/>
+          </w:tcPr>
+          <w:p>
+            <w:r>
+              <w:rPr>
+                <w:rFonts w:ascii="Times New Roman" w:hAnsi="Times New Roman"/>
+                <w:b w:val="0"/>
+                <w:i w:val="0"/>
+                <w:sz w:val="18"/>
+              </w:rPr>
+              <w:t>Dia 3</w:t>
+            </w:r>
+          </w:p>
+        </w:tc>
+        <w:tc>
+          <w:tcPr>
+            <w:tcW w:type="dxa" w:w="1567"/>
+          </w:tcPr>
+          <w:p>
+            <w:r>
+              <w:rPr>
+                <w:rFonts w:ascii="Times New Roman" w:hAnsi="Times New Roman"/>
+                <w:b w:val="0"/>
+                <w:i w:val="0"/>
+                <w:sz w:val="18"/>
+              </w:rPr>
+              <w:t>5,33</w:t>
+            </w:r>
+          </w:p>
+        </w:tc>
+        <w:tc>
+          <w:tcPr>
+            <w:tcW w:type="dxa" w:w="1567"/>
+          </w:tcPr>
+          <w:p>
+            <w:r>
+              <w:rPr>
+                <w:rFonts w:ascii="Times New Roman" w:hAnsi="Times New Roman"/>
+                <w:b w:val="0"/>
+                <w:i w:val="0"/>
+                <w:sz w:val="18"/>
+              </w:rPr>
+              <w:t>4,90</w:t>
+            </w:r>
+          </w:p>
+        </w:tc>
+        <w:tc>
+          <w:tcPr>
+            <w:tcW w:type="dxa" w:w="1567"/>
+          </w:tcPr>
+          <w:p>
+            <w:r>
+              <w:rPr>
+                <w:rFonts w:ascii="Times New Roman" w:hAnsi="Times New Roman"/>
+                <w:b w:val="0"/>
+                <w:i w:val="0"/>
+                <w:sz w:val="18"/>
+              </w:rPr>
+              <w:t>-0,43</w:t>
+            </w:r>
+          </w:p>
+        </w:tc>
+        <w:tc>
+          <w:tcPr>
+            <w:tcW w:type="dxa" w:w="1567"/>
+          </w:tcPr>
+          <w:p>
+            <w:r>
+              <w:rPr>
+                <w:rFonts w:ascii="Times New Roman" w:hAnsi="Times New Roman"/>
+                <w:b w:val="0"/>
+                <w:i w:val="0"/>
+                <w:sz w:val="18"/>
+              </w:rPr>
+              <w:t>-0,22</w:t>
+            </w:r>
+          </w:p>
+        </w:tc>
+        <w:tc>
+          <w:tcPr>
+            <w:tcW w:type="dxa" w:w="1567"/>
+          </w:tcPr>
+          <w:p>
+            <w:r>
+              <w:rPr>
+                <w:rFonts w:ascii="Times New Roman" w:hAnsi="Times New Roman"/>
+                <w:b w:val="0"/>
+                <w:i w:val="0"/>
+                <w:sz w:val="18"/>
+              </w:rPr>
+              <w:t>0,369</w:t>
+            </w:r>
+          </w:p>
+        </w:tc>
+      </w:tr>
+      <w:tr>
+        <w:tc>
+          <w:tcPr>
+            <w:tcW w:type="dxa" w:w="1567"/>
+          </w:tcPr>
+          <w:p>
+            <w:r>
+              <w:rPr>
+                <w:rFonts w:ascii="Times New Roman" w:hAnsi="Times New Roman"/>
+                <w:b w:val="0"/>
+                <w:i w:val="0"/>
+                <w:sz w:val="18"/>
+              </w:rPr>
+              <w:t>Dia 4</w:t>
+            </w:r>
+          </w:p>
+        </w:tc>
+        <w:tc>
+          <w:tcPr>
+            <w:tcW w:type="dxa" w:w="1567"/>
+          </w:tcPr>
+          <w:p>
+            <w:r>
+              <w:rPr>
+                <w:rFonts w:ascii="Times New Roman" w:hAnsi="Times New Roman"/>
+                <w:b w:val="0"/>
+                <w:i w:val="0"/>
+                <w:sz w:val="18"/>
+              </w:rPr>
+              <w:t>5,72</w:t>
+            </w:r>
+          </w:p>
+        </w:tc>
+        <w:tc>
+          <w:tcPr>
+            <w:tcW w:type="dxa" w:w="1567"/>
+          </w:tcPr>
+          <w:p>
+            <w:r>
+              <w:rPr>
+                <w:rFonts w:ascii="Times New Roman" w:hAnsi="Times New Roman"/>
+                <w:b w:val="0"/>
+                <w:i w:val="0"/>
+                <w:sz w:val="18"/>
+              </w:rPr>
+              <w:t>5,06</w:t>
+            </w:r>
+          </w:p>
+        </w:tc>
+        <w:tc>
+          <w:tcPr>
+            <w:tcW w:type="dxa" w:w="1567"/>
+          </w:tcPr>
+          <w:p>
+            <w:r>
+              <w:rPr>
+                <w:rFonts w:ascii="Times New Roman" w:hAnsi="Times New Roman"/>
+                <w:b w:val="0"/>
+                <w:i w:val="0"/>
+                <w:sz w:val="18"/>
+              </w:rPr>
+              <w:t>-0,67</w:t>
+            </w:r>
+          </w:p>
+        </w:tc>
+        <w:tc>
+          <w:tcPr>
+            <w:tcW w:type="dxa" w:w="1567"/>
+          </w:tcPr>
+          <w:p>
+            <w:r>
+              <w:rPr>
+                <w:rFonts w:ascii="Times New Roman" w:hAnsi="Times New Roman"/>
+                <w:b w:val="0"/>
+                <w:i w:val="0"/>
+                <w:sz w:val="18"/>
+              </w:rPr>
+              <w:t>-0,26</w:t>
+            </w:r>
+          </w:p>
+        </w:tc>
+        <w:tc>
+          <w:tcPr>
+            <w:tcW w:type="dxa" w:w="1567"/>
+          </w:tcPr>
+          <w:p>
+            <w:r>
+              <w:rPr>
+                <w:rFonts w:ascii="Times New Roman" w:hAnsi="Times New Roman"/>
+                <w:b w:val="0"/>
+                <w:i w:val="0"/>
+                <w:sz w:val="18"/>
+              </w:rPr>
+              <w:t>0,245</w:t>
+            </w:r>
+          </w:p>
+        </w:tc>
+      </w:tr>
+      <w:tr>
+        <w:tc>
+          <w:tcPr>
+            <w:tcW w:type="dxa" w:w="1567"/>
+          </w:tcPr>
+          <w:p>
+            <w:r>
+              <w:rPr>
+                <w:rFonts w:ascii="Times New Roman" w:hAnsi="Times New Roman"/>
+                <w:b w:val="0"/>
+                <w:i w:val="0"/>
+                <w:sz w:val="18"/>
+              </w:rPr>
+              <w:t>Dia 5</w:t>
+            </w:r>
+          </w:p>
+        </w:tc>
+        <w:tc>
+          <w:tcPr>
+            <w:tcW w:type="dxa" w:w="1567"/>
+          </w:tcPr>
+          <w:p>
+            <w:r>
+              <w:rPr>
+                <w:rFonts w:ascii="Times New Roman" w:hAnsi="Times New Roman"/>
+                <w:b w:val="0"/>
+                <w:i w:val="0"/>
+                <w:sz w:val="18"/>
+              </w:rPr>
+              <w:t>6,42</w:t>
+            </w:r>
+          </w:p>
+        </w:tc>
+        <w:tc>
+          <w:tcPr>
+            <w:tcW w:type="dxa" w:w="1567"/>
+          </w:tcPr>
+          <w:p>
+            <w:r>
+              <w:rPr>
+                <w:rFonts w:ascii="Times New Roman" w:hAnsi="Times New Roman"/>
+                <w:b w:val="0"/>
+                <w:i w:val="0"/>
+                <w:sz w:val="18"/>
+              </w:rPr>
+              <w:t>6,11</w:t>
+            </w:r>
+          </w:p>
+        </w:tc>
+        <w:tc>
+          <w:tcPr>
+            <w:tcW w:type="dxa" w:w="1567"/>
+          </w:tcPr>
+          <w:p>
+            <w:r>
+              <w:rPr>
+                <w:rFonts w:ascii="Times New Roman" w:hAnsi="Times New Roman"/>
+                <w:b w:val="0"/>
+                <w:i w:val="0"/>
+                <w:sz w:val="18"/>
+              </w:rPr>
+              <w:t>-0,32</w:t>
+            </w:r>
+          </w:p>
+        </w:tc>
+        <w:tc>
+          <w:tcPr>
+            <w:tcW w:type="dxa" w:w="1567"/>
+          </w:tcPr>
+          <w:p>
+            <w:r>
+              <w:rPr>
+                <w:rFonts w:ascii="Times New Roman" w:hAnsi="Times New Roman"/>
+                <w:b w:val="0"/>
+                <w:i w:val="0"/>
+                <w:sz w:val="18"/>
+              </w:rPr>
+              <w:t>-0,12</w:t>
+            </w:r>
+          </w:p>
+        </w:tc>
+        <w:tc>
+          <w:tcPr>
+            <w:tcW w:type="dxa" w:w="1567"/>
+          </w:tcPr>
+          <w:p>
+            <w:r>
+              <w:rPr>
+                <w:rFonts w:ascii="Times New Roman" w:hAnsi="Times New Roman"/>
+                <w:b w:val="0"/>
+                <w:i w:val="0"/>
+                <w:sz w:val="18"/>
+              </w:rPr>
+              <w:t>0,794</w:t>
+            </w:r>
+          </w:p>
+        </w:tc>
+      </w:tr>
+      <w:tr>
+        <w:tc>
+          <w:tcPr>
+            <w:tcW w:type="dxa" w:w="1567"/>
+          </w:tcPr>
+          <w:p>
+            <w:r>
+              <w:rPr>
+                <w:rFonts w:ascii="Times New Roman" w:hAnsi="Times New Roman"/>
+                <w:b w:val="0"/>
+                <w:i w:val="0"/>
+                <w:sz w:val="18"/>
+              </w:rPr>
+              <w:t>Dia 6</w:t>
+            </w:r>
+          </w:p>
+        </w:tc>
+        <w:tc>
+          <w:tcPr>
+            <w:tcW w:type="dxa" w:w="1567"/>
+          </w:tcPr>
+          <w:p>
+            <w:r>
+              <w:rPr>
+                <w:rFonts w:ascii="Times New Roman" w:hAnsi="Times New Roman"/>
+                <w:b w:val="0"/>
+                <w:i w:val="0"/>
+                <w:sz w:val="18"/>
+              </w:rPr>
+              <w:t>6,85</w:t>
+            </w:r>
+          </w:p>
+        </w:tc>
+        <w:tc>
+          <w:tcPr>
+            <w:tcW w:type="dxa" w:w="1567"/>
+          </w:tcPr>
+          <w:p>
+            <w:r>
+              <w:rPr>
+                <w:rFonts w:ascii="Times New Roman" w:hAnsi="Times New Roman"/>
+                <w:b w:val="0"/>
+                <w:i w:val="0"/>
+                <w:sz w:val="18"/>
+              </w:rPr>
+              <w:t>4,75</w:t>
+            </w:r>
+          </w:p>
+        </w:tc>
+        <w:tc>
+          <w:tcPr>
+            <w:tcW w:type="dxa" w:w="1567"/>
+          </w:tcPr>
+          <w:p>
+            <w:r>
+              <w:rPr>
+                <w:rFonts w:ascii="Times New Roman" w:hAnsi="Times New Roman"/>
+                <w:b w:val="0"/>
+                <w:i w:val="0"/>
+                <w:sz w:val="18"/>
+              </w:rPr>
+              <w:t>-2,10</w:t>
+            </w:r>
+          </w:p>
+        </w:tc>
+        <w:tc>
+          <w:tcPr>
+            <w:tcW w:type="dxa" w:w="1567"/>
+          </w:tcPr>
+          <w:p>
+            <w:r>
+              <w:rPr>
+                <w:rFonts w:ascii="Times New Roman" w:hAnsi="Times New Roman"/>
+                <w:b w:val="0"/>
+                <w:i w:val="0"/>
+                <w:sz w:val="18"/>
+              </w:rPr>
+              <w:t>-0,64</w:t>
+            </w:r>
+          </w:p>
+        </w:tc>
+        <w:tc>
+          <w:tcPr>
+            <w:tcW w:type="dxa" w:w="1567"/>
+          </w:tcPr>
+          <w:p>
+            <w:r>
+              <w:rPr>
+                <w:rFonts w:ascii="Times New Roman" w:hAnsi="Times New Roman"/>
+                <w:b w:val="0"/>
+                <w:i w:val="0"/>
+                <w:sz w:val="18"/>
+              </w:rPr>
+              <w:t>0,009*</w:t>
+            </w:r>
+          </w:p>
+        </w:tc>
+      </w:tr>
+      <w:tr>
+        <w:tc>
+          <w:tcPr>
+            <w:tcW w:type="dxa" w:w="1567"/>
+          </w:tcPr>
+          <w:p>
+            <w:r>
+              <w:rPr>
+                <w:rFonts w:ascii="Times New Roman" w:hAnsi="Times New Roman"/>
+                <w:b w:val="0"/>
+                <w:i w:val="0"/>
+                <w:sz w:val="18"/>
+              </w:rPr>
+              <w:t>Dia 7</w:t>
+            </w:r>
+          </w:p>
+        </w:tc>
+        <w:tc>
+          <w:tcPr>
+            <w:tcW w:type="dxa" w:w="1567"/>
+          </w:tcPr>
+          <w:p>
+            <w:r>
+              <w:rPr>
+                <w:rFonts w:ascii="Times New Roman" w:hAnsi="Times New Roman"/>
+                <w:b w:val="0"/>
+                <w:i w:val="0"/>
+                <w:sz w:val="18"/>
+              </w:rPr>
+              <w:t>4,88</w:t>
+            </w:r>
+          </w:p>
+        </w:tc>
+        <w:tc>
+          <w:tcPr>
+            <w:tcW w:type="dxa" w:w="1567"/>
+          </w:tcPr>
+          <w:p>
+            <w:r>
+              <w:rPr>
+                <w:rFonts w:ascii="Times New Roman" w:hAnsi="Times New Roman"/>
+                <w:b w:val="0"/>
+                <w:i w:val="0"/>
+                <w:sz w:val="18"/>
+              </w:rPr>
+              <w:t>4,38</w:t>
+            </w:r>
+          </w:p>
+        </w:tc>
+        <w:tc>
+          <w:tcPr>
+            <w:tcW w:type="dxa" w:w="1567"/>
+          </w:tcPr>
+          <w:p>
+            <w:r>
+              <w:rPr>
+                <w:rFonts w:ascii="Times New Roman" w:hAnsi="Times New Roman"/>
+                <w:b w:val="0"/>
+                <w:i w:val="0"/>
+                <w:sz w:val="18"/>
+              </w:rPr>
+              <w:t>-0,50</w:t>
+            </w:r>
+          </w:p>
+        </w:tc>
+        <w:tc>
+          <w:tcPr>
+            <w:tcW w:type="dxa" w:w="1567"/>
+          </w:tcPr>
+          <w:p>
+            <w:r>
+              <w:rPr>
+                <w:rFonts w:ascii="Times New Roman" w:hAnsi="Times New Roman"/>
+                <w:b w:val="0"/>
+                <w:i w:val="0"/>
+                <w:sz w:val="18"/>
+              </w:rPr>
+              <w:t>-0,20</w:t>
+            </w:r>
+          </w:p>
+        </w:tc>
+        <w:tc>
+          <w:tcPr>
+            <w:tcW w:type="dxa" w:w="1567"/>
+          </w:tcPr>
+          <w:p>
+            <w:r>
+              <w:rPr>
+                <w:rFonts w:ascii="Times New Roman" w:hAnsi="Times New Roman"/>
+                <w:b w:val="0"/>
+                <w:i w:val="0"/>
+                <w:sz w:val="18"/>
+              </w:rPr>
+              <w:t>0,453</w:t>
+            </w:r>
+          </w:p>
+        </w:tc>
+      </w:tr>
+    </w:tbl>
+    <w:p>
+      <w:pPr>
+        <w:spacing w:after="160" w:line="240" w:lineRule="auto"/>
+        <w:jc w:val="left"/>
+      </w:pPr>
+      <w:r>
+        <w:rPr>
+          <w:rFonts w:ascii="Times New Roman" w:hAnsi="Times New Roman"/>
+          <w:b w:val="0"/>
+          <w:i w:val="0"/>
+          <w:sz w:val="20"/>
+        </w:rPr>
+        <w:t>Fonte: Dados da pesquisa (2026).</w:t>
+      </w:r>
+    </w:p>
+    <w:p>
+      <w:pPr>
+        <w:spacing w:before="160" w:line="240" w:lineRule="auto"/>
+        <w:jc w:val="left"/>
+      </w:pPr>
+      <w:r>
+        <w:rPr>
+          <w:rFonts w:ascii="Times New Roman" w:hAnsi="Times New Roman"/>
+          <w:b w:val="0"/>
+          <w:i w:val="0"/>
+          <w:sz w:val="20"/>
+        </w:rPr>
+        <w:t>Tabela 6 – Fadiga (BRUMS): resposta pré→pós por dia (* p &lt; 0,05)</w:t>
+      </w:r>
+    </w:p>
+    <w:tbl>
+      <w:tblPr>
+        <w:tblW w:type="auto" w:w="0"/>
+        <w:jc w:val="center"/>
+        <w:tblLook w:firstColumn="1" w:firstRow="1" w:lastColumn="0" w:lastRow="0" w:noHBand="0" w:noVBand="1" w:val="04A0"/>
+        <w:tblBorders>
+          <w:top w:val="single" w:sz="6" w:space="0" w:color="000000"/>
+          <w:bottom w:val="single" w:sz="6" w:space="0" w:color="000000"/>
+          <w:insideH w:val="single" w:sz="6" w:space="0" w:color="000000"/>
+          <w:left w:val="none"/>
+          <w:right w:val="none"/>
+          <w:insideV w:val="none"/>
+        </w:tblBorders>
+      </w:tblPr>
+      <w:tblGrid>
+        <w:gridCol w:w="1567"/>
+        <w:gridCol w:w="1567"/>
+        <w:gridCol w:w="1567"/>
+        <w:gridCol w:w="1567"/>
+        <w:gridCol w:w="1567"/>
+        <w:gridCol w:w="1567"/>
+      </w:tblGrid>
+      <w:tr>
+        <w:tc>
+          <w:tcPr>
+            <w:tcW w:type="dxa" w:w="1567"/>
+          </w:tcPr>
+          <w:p>
+            <w:r>
+              <w:rPr>
+                <w:rFonts w:ascii="Times New Roman" w:hAnsi="Times New Roman"/>
+                <w:b/>
+                <w:i w:val="0"/>
+                <w:sz w:val="18"/>
+              </w:rPr>
+              <w:t>Dia</w:t>
+            </w:r>
+          </w:p>
+        </w:tc>
+        <w:tc>
+          <w:tcPr>
+            <w:tcW w:type="dxa" w:w="1567"/>
+          </w:tcPr>
+          <w:p>
+            <w:r>
+              <w:rPr>
+                <w:rFonts w:ascii="Times New Roman" w:hAnsi="Times New Roman"/>
+                <w:b/>
+                <w:i w:val="0"/>
+                <w:sz w:val="18"/>
+              </w:rPr>
+              <w:t>Pré</w:t>
+            </w:r>
+          </w:p>
+        </w:tc>
+        <w:tc>
+          <w:tcPr>
+            <w:tcW w:type="dxa" w:w="1567"/>
+          </w:tcPr>
+          <w:p>
+            <w:r>
+              <w:rPr>
+                <w:rFonts w:ascii="Times New Roman" w:hAnsi="Times New Roman"/>
+                <w:b/>
+                <w:i w:val="0"/>
+                <w:sz w:val="18"/>
+              </w:rPr>
+              <w:t>Pós</w:t>
+            </w:r>
+          </w:p>
+        </w:tc>
+        <w:tc>
+          <w:tcPr>
+            <w:tcW w:type="dxa" w:w="1567"/>
+          </w:tcPr>
+          <w:p>
+            <w:r>
+              <w:rPr>
+                <w:rFonts w:ascii="Times New Roman" w:hAnsi="Times New Roman"/>
+                <w:b/>
+                <w:i w:val="0"/>
+                <w:sz w:val="18"/>
+              </w:rPr>
+              <w:t>Δ (pós−pré)</w:t>
+            </w:r>
+          </w:p>
+        </w:tc>
+        <w:tc>
+          <w:tcPr>
+            <w:tcW w:type="dxa" w:w="1567"/>
+          </w:tcPr>
+          <w:p>
+            <w:r>
+              <w:rPr>
+                <w:rFonts w:ascii="Times New Roman" w:hAnsi="Times New Roman"/>
+                <w:b/>
+                <w:i w:val="0"/>
+                <w:sz w:val="18"/>
+              </w:rPr>
+              <w:t>dz</w:t>
+            </w:r>
+          </w:p>
+        </w:tc>
+        <w:tc>
+          <w:tcPr>
+            <w:tcW w:type="dxa" w:w="1567"/>
+          </w:tcPr>
+          <w:p>
+            <w:r>
+              <w:rPr>
+                <w:rFonts w:ascii="Times New Roman" w:hAnsi="Times New Roman"/>
+                <w:b/>
+                <w:i w:val="0"/>
+                <w:sz w:val="18"/>
+              </w:rPr>
+              <w:t>p</w:t>
+            </w:r>
+          </w:p>
+        </w:tc>
+      </w:tr>
+      <w:tr>
+        <w:tc>
+          <w:tcPr>
+            <w:tcW w:type="dxa" w:w="1567"/>
+          </w:tcPr>
+          <w:p>
+            <w:r>
+              <w:rPr>
+                <w:rFonts w:ascii="Times New Roman" w:hAnsi="Times New Roman"/>
+                <w:b w:val="0"/>
+                <w:i w:val="0"/>
+                <w:sz w:val="18"/>
+              </w:rPr>
+              <w:t>Dia 1</w:t>
+            </w:r>
+          </w:p>
+        </w:tc>
+        <w:tc>
+          <w:tcPr>
+            <w:tcW w:type="dxa" w:w="1567"/>
+          </w:tcPr>
+          <w:p>
+            <w:r>
+              <w:rPr>
+                <w:rFonts w:ascii="Times New Roman" w:hAnsi="Times New Roman"/>
+                <w:b w:val="0"/>
+                <w:i w:val="0"/>
+                <w:sz w:val="18"/>
+              </w:rPr>
+              <w:t>2,27</w:t>
+            </w:r>
+          </w:p>
+        </w:tc>
+        <w:tc>
+          <w:tcPr>
+            <w:tcW w:type="dxa" w:w="1567"/>
+          </w:tcPr>
+          <w:p>
+            <w:r>
+              <w:rPr>
+                <w:rFonts w:ascii="Times New Roman" w:hAnsi="Times New Roman"/>
+                <w:b w:val="0"/>
+                <w:i w:val="0"/>
+                <w:sz w:val="18"/>
+              </w:rPr>
+              <w:t>4,40</w:t>
+            </w:r>
+          </w:p>
+        </w:tc>
+        <w:tc>
+          <w:tcPr>
+            <w:tcW w:type="dxa" w:w="1567"/>
+          </w:tcPr>
+          <w:p>
+            <w:r>
+              <w:rPr>
+                <w:rFonts w:ascii="Times New Roman" w:hAnsi="Times New Roman"/>
+                <w:b w:val="0"/>
+                <w:i w:val="0"/>
+                <w:sz w:val="18"/>
+              </w:rPr>
+              <w:t>+2,13</w:t>
+            </w:r>
+          </w:p>
+        </w:tc>
+        <w:tc>
+          <w:tcPr>
+            <w:tcW w:type="dxa" w:w="1567"/>
+          </w:tcPr>
+          <w:p>
+            <w:r>
+              <w:rPr>
+                <w:rFonts w:ascii="Times New Roman" w:hAnsi="Times New Roman"/>
+                <w:b w:val="0"/>
+                <w:i w:val="0"/>
+                <w:sz w:val="18"/>
+              </w:rPr>
+              <w:t>+0,74</w:t>
+            </w:r>
+          </w:p>
+        </w:tc>
+        <w:tc>
+          <w:tcPr>
+            <w:tcW w:type="dxa" w:w="1567"/>
+          </w:tcPr>
+          <w:p>
+            <w:r>
+              <w:rPr>
+                <w:rFonts w:ascii="Times New Roman" w:hAnsi="Times New Roman"/>
+                <w:b w:val="0"/>
+                <w:i w:val="0"/>
+                <w:sz w:val="18"/>
+              </w:rPr>
+              <w:t>0,012*</w:t>
+            </w:r>
+          </w:p>
+        </w:tc>
+      </w:tr>
+      <w:tr>
+        <w:tc>
+          <w:tcPr>
+            <w:tcW w:type="dxa" w:w="1567"/>
+          </w:tcPr>
+          <w:p>
+            <w:r>
+              <w:rPr>
+                <w:rFonts w:ascii="Times New Roman" w:hAnsi="Times New Roman"/>
+                <w:b w:val="0"/>
+                <w:i w:val="0"/>
+                <w:sz w:val="18"/>
+              </w:rPr>
+              <w:t>Dia 2</w:t>
+            </w:r>
+          </w:p>
+        </w:tc>
+        <w:tc>
+          <w:tcPr>
+            <w:tcW w:type="dxa" w:w="1567"/>
+          </w:tcPr>
+          <w:p>
+            <w:r>
+              <w:rPr>
+                <w:rFonts w:ascii="Times New Roman" w:hAnsi="Times New Roman"/>
+                <w:b w:val="0"/>
+                <w:i w:val="0"/>
+                <w:sz w:val="18"/>
+              </w:rPr>
+              <w:t>3,96</w:t>
+            </w:r>
+          </w:p>
+        </w:tc>
+        <w:tc>
+          <w:tcPr>
+            <w:tcW w:type="dxa" w:w="1567"/>
+          </w:tcPr>
+          <w:p>
+            <w:r>
+              <w:rPr>
+                <w:rFonts w:ascii="Times New Roman" w:hAnsi="Times New Roman"/>
+                <w:b w:val="0"/>
+                <w:i w:val="0"/>
+                <w:sz w:val="18"/>
+              </w:rPr>
+              <w:t>6,54</w:t>
+            </w:r>
+          </w:p>
+        </w:tc>
+        <w:tc>
+          <w:tcPr>
+            <w:tcW w:type="dxa" w:w="1567"/>
+          </w:tcPr>
+          <w:p>
+            <w:r>
+              <w:rPr>
+                <w:rFonts w:ascii="Times New Roman" w:hAnsi="Times New Roman"/>
+                <w:b w:val="0"/>
+                <w:i w:val="0"/>
+                <w:sz w:val="18"/>
+              </w:rPr>
+              <w:t>+2,58</w:t>
+            </w:r>
+          </w:p>
+        </w:tc>
+        <w:tc>
+          <w:tcPr>
+            <w:tcW w:type="dxa" w:w="1567"/>
+          </w:tcPr>
+          <w:p>
+            <w:r>
+              <w:rPr>
+                <w:rFonts w:ascii="Times New Roman" w:hAnsi="Times New Roman"/>
+                <w:b w:val="0"/>
+                <w:i w:val="0"/>
+                <w:sz w:val="18"/>
+              </w:rPr>
+              <w:t>+0,64</w:t>
+            </w:r>
+          </w:p>
+        </w:tc>
+        <w:tc>
+          <w:tcPr>
+            <w:tcW w:type="dxa" w:w="1567"/>
+          </w:tcPr>
+          <w:p>
+            <w:r>
+              <w:rPr>
+                <w:rFonts w:ascii="Times New Roman" w:hAnsi="Times New Roman"/>
+                <w:b w:val="0"/>
+                <w:i w:val="0"/>
+                <w:sz w:val="18"/>
+              </w:rPr>
+              <w:t>0,008*</w:t>
+            </w:r>
+          </w:p>
+        </w:tc>
+      </w:tr>
+      <w:tr>
+        <w:tc>
+          <w:tcPr>
+            <w:tcW w:type="dxa" w:w="1567"/>
+          </w:tcPr>
+          <w:p>
+            <w:r>
+              <w:rPr>
+                <w:rFonts w:ascii="Times New Roman" w:hAnsi="Times New Roman"/>
+                <w:b w:val="0"/>
+                <w:i w:val="0"/>
+                <w:sz w:val="18"/>
+              </w:rPr>
+              <w:t>Dia 3</w:t>
+            </w:r>
+          </w:p>
+        </w:tc>
+        <w:tc>
+          <w:tcPr>
+            <w:tcW w:type="dxa" w:w="1567"/>
+          </w:tcPr>
+          <w:p>
+            <w:r>
+              <w:rPr>
+                <w:rFonts w:ascii="Times New Roman" w:hAnsi="Times New Roman"/>
+                <w:b w:val="0"/>
+                <w:i w:val="0"/>
+                <w:sz w:val="18"/>
+              </w:rPr>
+              <w:t>5,14</w:t>
+            </w:r>
+          </w:p>
+        </w:tc>
+        <w:tc>
+          <w:tcPr>
+            <w:tcW w:type="dxa" w:w="1567"/>
+          </w:tcPr>
+          <w:p>
+            <w:r>
+              <w:rPr>
+                <w:rFonts w:ascii="Times New Roman" w:hAnsi="Times New Roman"/>
+                <w:b w:val="0"/>
+                <w:i w:val="0"/>
+                <w:sz w:val="18"/>
+              </w:rPr>
+              <w:t>5,90</w:t>
+            </w:r>
+          </w:p>
+        </w:tc>
+        <w:tc>
+          <w:tcPr>
+            <w:tcW w:type="dxa" w:w="1567"/>
+          </w:tcPr>
+          <w:p>
+            <w:r>
+              <w:rPr>
+                <w:rFonts w:ascii="Times New Roman" w:hAnsi="Times New Roman"/>
+                <w:b w:val="0"/>
+                <w:i w:val="0"/>
+                <w:sz w:val="18"/>
+              </w:rPr>
+              <w:t>+0,76</w:t>
+            </w:r>
+          </w:p>
+        </w:tc>
+        <w:tc>
+          <w:tcPr>
+            <w:tcW w:type="dxa" w:w="1567"/>
+          </w:tcPr>
+          <w:p>
+            <w:r>
+              <w:rPr>
+                <w:rFonts w:ascii="Times New Roman" w:hAnsi="Times New Roman"/>
+                <w:b w:val="0"/>
+                <w:i w:val="0"/>
+                <w:sz w:val="18"/>
+              </w:rPr>
+              <w:t>+0,28</w:t>
+            </w:r>
+          </w:p>
+        </w:tc>
+        <w:tc>
+          <w:tcPr>
+            <w:tcW w:type="dxa" w:w="1567"/>
+          </w:tcPr>
+          <w:p>
+            <w:r>
+              <w:rPr>
+                <w:rFonts w:ascii="Times New Roman" w:hAnsi="Times New Roman"/>
+                <w:b w:val="0"/>
+                <w:i w:val="0"/>
+                <w:sz w:val="18"/>
+              </w:rPr>
+              <w:t>0,259</w:t>
+            </w:r>
+          </w:p>
+        </w:tc>
+      </w:tr>
+      <w:tr>
+        <w:tc>
+          <w:tcPr>
+            <w:tcW w:type="dxa" w:w="1567"/>
+          </w:tcPr>
+          <w:p>
+            <w:r>
+              <w:rPr>
+                <w:rFonts w:ascii="Times New Roman" w:hAnsi="Times New Roman"/>
+                <w:b w:val="0"/>
+                <w:i w:val="0"/>
+                <w:sz w:val="18"/>
+              </w:rPr>
+              <w:t>Dia 4</w:t>
+            </w:r>
+          </w:p>
+        </w:tc>
+        <w:tc>
+          <w:tcPr>
+            <w:tcW w:type="dxa" w:w="1567"/>
+          </w:tcPr>
+          <w:p>
+            <w:r>
+              <w:rPr>
+                <w:rFonts w:ascii="Times New Roman" w:hAnsi="Times New Roman"/>
+                <w:b w:val="0"/>
+                <w:i w:val="0"/>
+                <w:sz w:val="18"/>
+              </w:rPr>
+              <w:t>5,50</w:t>
+            </w:r>
+          </w:p>
+        </w:tc>
+        <w:tc>
+          <w:tcPr>
+            <w:tcW w:type="dxa" w:w="1567"/>
+          </w:tcPr>
+          <w:p>
+            <w:r>
+              <w:rPr>
+                <w:rFonts w:ascii="Times New Roman" w:hAnsi="Times New Roman"/>
+                <w:b w:val="0"/>
+                <w:i w:val="0"/>
+                <w:sz w:val="18"/>
+              </w:rPr>
+              <w:t>6,28</w:t>
+            </w:r>
+          </w:p>
+        </w:tc>
+        <w:tc>
+          <w:tcPr>
+            <w:tcW w:type="dxa" w:w="1567"/>
+          </w:tcPr>
+          <w:p>
+            <w:r>
+              <w:rPr>
+                <w:rFonts w:ascii="Times New Roman" w:hAnsi="Times New Roman"/>
+                <w:b w:val="0"/>
+                <w:i w:val="0"/>
+                <w:sz w:val="18"/>
+              </w:rPr>
+              <w:t>+0,78</w:t>
+            </w:r>
+          </w:p>
+        </w:tc>
+        <w:tc>
+          <w:tcPr>
+            <w:tcW w:type="dxa" w:w="1567"/>
+          </w:tcPr>
+          <w:p>
+            <w:r>
+              <w:rPr>
+                <w:rFonts w:ascii="Times New Roman" w:hAnsi="Times New Roman"/>
+                <w:b w:val="0"/>
+                <w:i w:val="0"/>
+                <w:sz w:val="18"/>
+              </w:rPr>
+              <w:t>+0,23</w:t>
+            </w:r>
+          </w:p>
+        </w:tc>
+        <w:tc>
+          <w:tcPr>
+            <w:tcW w:type="dxa" w:w="1567"/>
+          </w:tcPr>
+          <w:p>
+            <w:r>
+              <w:rPr>
+                <w:rFonts w:ascii="Times New Roman" w:hAnsi="Times New Roman"/>
+                <w:b w:val="0"/>
+                <w:i w:val="0"/>
+                <w:sz w:val="18"/>
+              </w:rPr>
+              <w:t>0,362</w:t>
+            </w:r>
+          </w:p>
+        </w:tc>
+      </w:tr>
+      <w:tr>
+        <w:tc>
+          <w:tcPr>
+            <w:tcW w:type="dxa" w:w="1567"/>
+          </w:tcPr>
+          <w:p>
+            <w:r>
+              <w:rPr>
+                <w:rFonts w:ascii="Times New Roman" w:hAnsi="Times New Roman"/>
+                <w:b w:val="0"/>
+                <w:i w:val="0"/>
+                <w:sz w:val="18"/>
+              </w:rPr>
+              <w:t>Dia 5</w:t>
+            </w:r>
+          </w:p>
+        </w:tc>
+        <w:tc>
+          <w:tcPr>
+            <w:tcW w:type="dxa" w:w="1567"/>
+          </w:tcPr>
+          <w:p>
+            <w:r>
+              <w:rPr>
+                <w:rFonts w:ascii="Times New Roman" w:hAnsi="Times New Roman"/>
+                <w:b w:val="0"/>
+                <w:i w:val="0"/>
+                <w:sz w:val="18"/>
+              </w:rPr>
+              <w:t>4,42</w:t>
+            </w:r>
+          </w:p>
+        </w:tc>
+        <w:tc>
+          <w:tcPr>
+            <w:tcW w:type="dxa" w:w="1567"/>
+          </w:tcPr>
+          <w:p>
+            <w:r>
+              <w:rPr>
+                <w:rFonts w:ascii="Times New Roman" w:hAnsi="Times New Roman"/>
+                <w:b w:val="0"/>
+                <w:i w:val="0"/>
+                <w:sz w:val="18"/>
+              </w:rPr>
+              <w:t>5,53</w:t>
+            </w:r>
+          </w:p>
+        </w:tc>
+        <w:tc>
+          <w:tcPr>
+            <w:tcW w:type="dxa" w:w="1567"/>
+          </w:tcPr>
+          <w:p>
+            <w:r>
+              <w:rPr>
+                <w:rFonts w:ascii="Times New Roman" w:hAnsi="Times New Roman"/>
+                <w:b w:val="0"/>
+                <w:i w:val="0"/>
+                <w:sz w:val="18"/>
+              </w:rPr>
+              <w:t>+1,11</w:t>
+            </w:r>
+          </w:p>
+        </w:tc>
+        <w:tc>
+          <w:tcPr>
+            <w:tcW w:type="dxa" w:w="1567"/>
+          </w:tcPr>
+          <w:p>
+            <w:r>
+              <w:rPr>
+                <w:rFonts w:ascii="Times New Roman" w:hAnsi="Times New Roman"/>
+                <w:b w:val="0"/>
+                <w:i w:val="0"/>
+                <w:sz w:val="18"/>
+              </w:rPr>
+              <w:t>+0,38</w:t>
+            </w:r>
+          </w:p>
+        </w:tc>
+        <w:tc>
+          <w:tcPr>
+            <w:tcW w:type="dxa" w:w="1567"/>
+          </w:tcPr>
+          <w:p>
+            <w:r>
+              <w:rPr>
+                <w:rFonts w:ascii="Times New Roman" w:hAnsi="Times New Roman"/>
+                <w:b w:val="0"/>
+                <w:i w:val="0"/>
+                <w:sz w:val="18"/>
+              </w:rPr>
+              <w:t>0,121</w:t>
+            </w:r>
+          </w:p>
+        </w:tc>
+      </w:tr>
+      <w:tr>
+        <w:tc>
+          <w:tcPr>
+            <w:tcW w:type="dxa" w:w="1567"/>
+          </w:tcPr>
+          <w:p>
+            <w:r>
+              <w:rPr>
+                <w:rFonts w:ascii="Times New Roman" w:hAnsi="Times New Roman"/>
+                <w:b w:val="0"/>
+                <w:i w:val="0"/>
+                <w:sz w:val="18"/>
+              </w:rPr>
+              <w:t>Dia 6</w:t>
+            </w:r>
+          </w:p>
+        </w:tc>
+        <w:tc>
+          <w:tcPr>
+            <w:tcW w:type="dxa" w:w="1567"/>
+          </w:tcPr>
+          <w:p>
+            <w:r>
+              <w:rPr>
+                <w:rFonts w:ascii="Times New Roman" w:hAnsi="Times New Roman"/>
+                <w:b w:val="0"/>
+                <w:i w:val="0"/>
+                <w:sz w:val="18"/>
+              </w:rPr>
+              <w:t>5,35</w:t>
+            </w:r>
+          </w:p>
+        </w:tc>
+        <w:tc>
+          <w:tcPr>
+            <w:tcW w:type="dxa" w:w="1567"/>
+          </w:tcPr>
+          <w:p>
+            <w:r>
+              <w:rPr>
+                <w:rFonts w:ascii="Times New Roman" w:hAnsi="Times New Roman"/>
+                <w:b w:val="0"/>
+                <w:i w:val="0"/>
+                <w:sz w:val="18"/>
+              </w:rPr>
+              <w:t>6,70</w:t>
+            </w:r>
+          </w:p>
+        </w:tc>
+        <w:tc>
+          <w:tcPr>
+            <w:tcW w:type="dxa" w:w="1567"/>
+          </w:tcPr>
+          <w:p>
+            <w:r>
+              <w:rPr>
+                <w:rFonts w:ascii="Times New Roman" w:hAnsi="Times New Roman"/>
+                <w:b w:val="0"/>
+                <w:i w:val="0"/>
+                <w:sz w:val="18"/>
+              </w:rPr>
+              <w:t>+1,35</w:t>
+            </w:r>
+          </w:p>
+        </w:tc>
+        <w:tc>
+          <w:tcPr>
+            <w:tcW w:type="dxa" w:w="1567"/>
+          </w:tcPr>
+          <w:p>
+            <w:r>
+              <w:rPr>
+                <w:rFonts w:ascii="Times New Roman" w:hAnsi="Times New Roman"/>
+                <w:b w:val="0"/>
+                <w:i w:val="0"/>
+                <w:sz w:val="18"/>
+              </w:rPr>
+              <w:t>+0,36</w:t>
+            </w:r>
+          </w:p>
+        </w:tc>
+        <w:tc>
+          <w:tcPr>
+            <w:tcW w:type="dxa" w:w="1567"/>
+          </w:tcPr>
+          <w:p>
+            <w:r>
+              <w:rPr>
+                <w:rFonts w:ascii="Times New Roman" w:hAnsi="Times New Roman"/>
+                <w:b w:val="0"/>
+                <w:i w:val="0"/>
+                <w:sz w:val="18"/>
+              </w:rPr>
+              <w:t>0,171</w:t>
+            </w:r>
+          </w:p>
+        </w:tc>
+      </w:tr>
+      <w:tr>
+        <w:tc>
+          <w:tcPr>
+            <w:tcW w:type="dxa" w:w="1567"/>
+          </w:tcPr>
+          <w:p>
+            <w:r>
+              <w:rPr>
+                <w:rFonts w:ascii="Times New Roman" w:hAnsi="Times New Roman"/>
+                <w:b w:val="0"/>
+                <w:i w:val="0"/>
+                <w:sz w:val="18"/>
+              </w:rPr>
+              <w:t>Dia 7</w:t>
+            </w:r>
+          </w:p>
+        </w:tc>
+        <w:tc>
+          <w:tcPr>
+            <w:tcW w:type="dxa" w:w="1567"/>
+          </w:tcPr>
+          <w:p>
+            <w:r>
+              <w:rPr>
+                <w:rFonts w:ascii="Times New Roman" w:hAnsi="Times New Roman"/>
+                <w:b w:val="0"/>
+                <w:i w:val="0"/>
+                <w:sz w:val="18"/>
+              </w:rPr>
+              <w:t>6,25</w:t>
+            </w:r>
+          </w:p>
+        </w:tc>
+        <w:tc>
+          <w:tcPr>
+            <w:tcW w:type="dxa" w:w="1567"/>
+          </w:tcPr>
+          <w:p>
+            <w:r>
+              <w:rPr>
+                <w:rFonts w:ascii="Times New Roman" w:hAnsi="Times New Roman"/>
+                <w:b w:val="0"/>
+                <w:i w:val="0"/>
+                <w:sz w:val="18"/>
+              </w:rPr>
+              <w:t>7,81</w:t>
+            </w:r>
+          </w:p>
+        </w:tc>
+        <w:tc>
+          <w:tcPr>
+            <w:tcW w:type="dxa" w:w="1567"/>
+          </w:tcPr>
+          <w:p>
+            <w:r>
+              <w:rPr>
+                <w:rFonts w:ascii="Times New Roman" w:hAnsi="Times New Roman"/>
+                <w:b w:val="0"/>
+                <w:i w:val="0"/>
+                <w:sz w:val="18"/>
+              </w:rPr>
+              <w:t>+1,56</w:t>
+            </w:r>
+          </w:p>
+        </w:tc>
+        <w:tc>
+          <w:tcPr>
+            <w:tcW w:type="dxa" w:w="1567"/>
+          </w:tcPr>
+          <w:p>
+            <w:r>
+              <w:rPr>
+                <w:rFonts w:ascii="Times New Roman" w:hAnsi="Times New Roman"/>
+                <w:b w:val="0"/>
+                <w:i w:val="0"/>
+                <w:sz w:val="18"/>
+              </w:rPr>
+              <w:t>+0,48</w:t>
+            </w:r>
+          </w:p>
+        </w:tc>
+        <w:tc>
+          <w:tcPr>
+            <w:tcW w:type="dxa" w:w="1567"/>
+          </w:tcPr>
+          <w:p>
+            <w:r>
+              <w:rPr>
+                <w:rFonts w:ascii="Times New Roman" w:hAnsi="Times New Roman"/>
+                <w:b w:val="0"/>
+                <w:i w:val="0"/>
+                <w:sz w:val="18"/>
+              </w:rPr>
+              <w:t>0,072</w:t>
+            </w:r>
+          </w:p>
+        </w:tc>
+      </w:tr>
+    </w:tbl>
+    <w:p>
+      <w:pPr>
+        <w:spacing w:after="160" w:line="240" w:lineRule="auto"/>
+        <w:jc w:val="left"/>
+      </w:pPr>
+      <w:r>
+        <w:rPr>
+          <w:rFonts w:ascii="Times New Roman" w:hAnsi="Times New Roman"/>
+          <w:b w:val="0"/>
+          <w:i w:val="0"/>
+          <w:sz w:val="20"/>
+        </w:rPr>
+        <w:t>Fonte: Dados da pesquisa (2026).</w:t>
+      </w:r>
+    </w:p>
+    <w:p>
+      <w:pPr>
+        <w:spacing w:before="160" w:line="240" w:lineRule="auto"/>
+        <w:jc w:val="left"/>
+      </w:pPr>
+      <w:r>
+        <w:rPr>
+          <w:rFonts w:ascii="Times New Roman" w:hAnsi="Times New Roman"/>
+          <w:b w:val="0"/>
+          <w:i w:val="0"/>
+          <w:sz w:val="20"/>
+        </w:rPr>
+        <w:t>Tabela 7 – Fadiga física: resposta pré→pós por dia (* p &lt; 0,05)</w:t>
+      </w:r>
+    </w:p>
+    <w:tbl>
+      <w:tblPr>
+        <w:tblW w:type="auto" w:w="0"/>
+        <w:jc w:val="center"/>
+        <w:tblLook w:firstColumn="1" w:firstRow="1" w:lastColumn="0" w:lastRow="0" w:noHBand="0" w:noVBand="1" w:val="04A0"/>
+        <w:tblBorders>
+          <w:top w:val="single" w:sz="6" w:space="0" w:color="000000"/>
+          <w:bottom w:val="single" w:sz="6" w:space="0" w:color="000000"/>
+          <w:insideH w:val="single" w:sz="6" w:space="0" w:color="000000"/>
+          <w:left w:val="none"/>
+          <w:right w:val="none"/>
+          <w:insideV w:val="none"/>
+        </w:tblBorders>
+      </w:tblPr>
+      <w:tblGrid>
+        <w:gridCol w:w="1567"/>
+        <w:gridCol w:w="1567"/>
+        <w:gridCol w:w="1567"/>
+        <w:gridCol w:w="1567"/>
+        <w:gridCol w:w="1567"/>
+        <w:gridCol w:w="1567"/>
+      </w:tblGrid>
+      <w:tr>
+        <w:tc>
+          <w:tcPr>
+            <w:tcW w:type="dxa" w:w="1567"/>
+          </w:tcPr>
+          <w:p>
+            <w:r>
+              <w:rPr>
+                <w:rFonts w:ascii="Times New Roman" w:hAnsi="Times New Roman"/>
+                <w:b/>
+                <w:i w:val="0"/>
+                <w:sz w:val="18"/>
+              </w:rPr>
+              <w:t>Dia</w:t>
+            </w:r>
+          </w:p>
+        </w:tc>
+        <w:tc>
+          <w:tcPr>
+            <w:tcW w:type="dxa" w:w="1567"/>
+          </w:tcPr>
+          <w:p>
+            <w:r>
+              <w:rPr>
+                <w:rFonts w:ascii="Times New Roman" w:hAnsi="Times New Roman"/>
+                <w:b/>
+                <w:i w:val="0"/>
+                <w:sz w:val="18"/>
+              </w:rPr>
+              <w:t>Pré</w:t>
+            </w:r>
+          </w:p>
+        </w:tc>
+        <w:tc>
+          <w:tcPr>
+            <w:tcW w:type="dxa" w:w="1567"/>
+          </w:tcPr>
+          <w:p>
+            <w:r>
+              <w:rPr>
+                <w:rFonts w:ascii="Times New Roman" w:hAnsi="Times New Roman"/>
+                <w:b/>
+                <w:i w:val="0"/>
+                <w:sz w:val="18"/>
+              </w:rPr>
+              <w:t>Pós</w:t>
+            </w:r>
+          </w:p>
+        </w:tc>
+        <w:tc>
+          <w:tcPr>
+            <w:tcW w:type="dxa" w:w="1567"/>
+          </w:tcPr>
+          <w:p>
+            <w:r>
+              <w:rPr>
+                <w:rFonts w:ascii="Times New Roman" w:hAnsi="Times New Roman"/>
+                <w:b/>
+                <w:i w:val="0"/>
+                <w:sz w:val="18"/>
+              </w:rPr>
+              <w:t>Δ (pós−pré)</w:t>
+            </w:r>
+          </w:p>
+        </w:tc>
+        <w:tc>
+          <w:tcPr>
+            <w:tcW w:type="dxa" w:w="1567"/>
+          </w:tcPr>
+          <w:p>
+            <w:r>
+              <w:rPr>
+                <w:rFonts w:ascii="Times New Roman" w:hAnsi="Times New Roman"/>
+                <w:b/>
+                <w:i w:val="0"/>
+                <w:sz w:val="18"/>
+              </w:rPr>
+              <w:t>dz</w:t>
+            </w:r>
+          </w:p>
+        </w:tc>
+        <w:tc>
+          <w:tcPr>
+            <w:tcW w:type="dxa" w:w="1567"/>
+          </w:tcPr>
+          <w:p>
+            <w:r>
+              <w:rPr>
+                <w:rFonts w:ascii="Times New Roman" w:hAnsi="Times New Roman"/>
+                <w:b/>
+                <w:i w:val="0"/>
+                <w:sz w:val="18"/>
+              </w:rPr>
+              <w:t>p</w:t>
+            </w:r>
+          </w:p>
+        </w:tc>
+      </w:tr>
+      <w:tr>
+        <w:tc>
+          <w:tcPr>
+            <w:tcW w:type="dxa" w:w="1567"/>
+          </w:tcPr>
+          <w:p>
+            <w:r>
+              <w:rPr>
+                <w:rFonts w:ascii="Times New Roman" w:hAnsi="Times New Roman"/>
+                <w:b w:val="0"/>
+                <w:i w:val="0"/>
+                <w:sz w:val="18"/>
+              </w:rPr>
+              <w:t>Dia 1</w:t>
+            </w:r>
+          </w:p>
+        </w:tc>
+        <w:tc>
+          <w:tcPr>
+            <w:tcW w:type="dxa" w:w="1567"/>
+          </w:tcPr>
+          <w:p>
+            <w:r>
+              <w:rPr>
+                <w:rFonts w:ascii="Times New Roman" w:hAnsi="Times New Roman"/>
+                <w:b w:val="0"/>
+                <w:i w:val="0"/>
+                <w:sz w:val="18"/>
+              </w:rPr>
+              <w:t>3,27</w:t>
+            </w:r>
+          </w:p>
+        </w:tc>
+        <w:tc>
+          <w:tcPr>
+            <w:tcW w:type="dxa" w:w="1567"/>
+          </w:tcPr>
+          <w:p>
+            <w:r>
+              <w:rPr>
+                <w:rFonts w:ascii="Times New Roman" w:hAnsi="Times New Roman"/>
+                <w:b w:val="0"/>
+                <w:i w:val="0"/>
+                <w:sz w:val="18"/>
+              </w:rPr>
+              <w:t>5,47</w:t>
+            </w:r>
+          </w:p>
+        </w:tc>
+        <w:tc>
+          <w:tcPr>
+            <w:tcW w:type="dxa" w:w="1567"/>
+          </w:tcPr>
+          <w:p>
+            <w:r>
+              <w:rPr>
+                <w:rFonts w:ascii="Times New Roman" w:hAnsi="Times New Roman"/>
+                <w:b w:val="0"/>
+                <w:i w:val="0"/>
+                <w:sz w:val="18"/>
+              </w:rPr>
+              <w:t>+2,20</w:t>
+            </w:r>
+          </w:p>
+        </w:tc>
+        <w:tc>
+          <w:tcPr>
+            <w:tcW w:type="dxa" w:w="1567"/>
+          </w:tcPr>
+          <w:p>
+            <w:r>
+              <w:rPr>
+                <w:rFonts w:ascii="Times New Roman" w:hAnsi="Times New Roman"/>
+                <w:b w:val="0"/>
+                <w:i w:val="0"/>
+                <w:sz w:val="18"/>
+              </w:rPr>
+              <w:t>+1,33</w:t>
+            </w:r>
+          </w:p>
+        </w:tc>
+        <w:tc>
+          <w:tcPr>
+            <w:tcW w:type="dxa" w:w="1567"/>
+          </w:tcPr>
+          <w:p>
+            <w:r>
+              <w:rPr>
+                <w:rFonts w:ascii="Times New Roman" w:hAnsi="Times New Roman"/>
+                <w:b w:val="0"/>
+                <w:i w:val="0"/>
+                <w:sz w:val="18"/>
+              </w:rPr>
+              <w:t>0,002*</w:t>
+            </w:r>
+          </w:p>
+        </w:tc>
+      </w:tr>
+      <w:tr>
+        <w:tc>
+          <w:tcPr>
+            <w:tcW w:type="dxa" w:w="1567"/>
+          </w:tcPr>
+          <w:p>
+            <w:r>
+              <w:rPr>
+                <w:rFonts w:ascii="Times New Roman" w:hAnsi="Times New Roman"/>
+                <w:b w:val="0"/>
+                <w:i w:val="0"/>
+                <w:sz w:val="18"/>
+              </w:rPr>
+              <w:t>Dia 2</w:t>
+            </w:r>
+          </w:p>
+        </w:tc>
+        <w:tc>
+          <w:tcPr>
+            <w:tcW w:type="dxa" w:w="1567"/>
+          </w:tcPr>
+          <w:p>
+            <w:r>
+              <w:rPr>
+                <w:rFonts w:ascii="Times New Roman" w:hAnsi="Times New Roman"/>
+                <w:b w:val="0"/>
+                <w:i w:val="0"/>
+                <w:sz w:val="18"/>
+              </w:rPr>
+              <w:t>4,19</w:t>
+            </w:r>
+          </w:p>
+        </w:tc>
+        <w:tc>
+          <w:tcPr>
+            <w:tcW w:type="dxa" w:w="1567"/>
+          </w:tcPr>
+          <w:p>
+            <w:r>
+              <w:rPr>
+                <w:rFonts w:ascii="Times New Roman" w:hAnsi="Times New Roman"/>
+                <w:b w:val="0"/>
+                <w:i w:val="0"/>
+                <w:sz w:val="18"/>
+              </w:rPr>
+              <w:t>6,69</w:t>
+            </w:r>
+          </w:p>
+        </w:tc>
+        <w:tc>
+          <w:tcPr>
+            <w:tcW w:type="dxa" w:w="1567"/>
+          </w:tcPr>
+          <w:p>
+            <w:r>
+              <w:rPr>
+                <w:rFonts w:ascii="Times New Roman" w:hAnsi="Times New Roman"/>
+                <w:b w:val="0"/>
+                <w:i w:val="0"/>
+                <w:sz w:val="18"/>
+              </w:rPr>
+              <w:t>+2,50</w:t>
+            </w:r>
+          </w:p>
+        </w:tc>
+        <w:tc>
+          <w:tcPr>
+            <w:tcW w:type="dxa" w:w="1567"/>
+          </w:tcPr>
+          <w:p>
+            <w:r>
+              <w:rPr>
+                <w:rFonts w:ascii="Times New Roman" w:hAnsi="Times New Roman"/>
+                <w:b w:val="0"/>
+                <w:i w:val="0"/>
+                <w:sz w:val="18"/>
+              </w:rPr>
+              <w:t>+0,97</w:t>
+            </w:r>
+          </w:p>
+        </w:tc>
+        <w:tc>
+          <w:tcPr>
+            <w:tcW w:type="dxa" w:w="1567"/>
+          </w:tcPr>
+          <w:p>
+            <w:r>
+              <w:rPr>
+                <w:rFonts w:ascii="Times New Roman" w:hAnsi="Times New Roman"/>
+                <w:b w:val="0"/>
+                <w:i w:val="0"/>
+                <w:sz w:val="18"/>
+              </w:rPr>
+              <w:t>&lt;0,001*</w:t>
+            </w:r>
+          </w:p>
+        </w:tc>
+      </w:tr>
+      <w:tr>
+        <w:tc>
+          <w:tcPr>
+            <w:tcW w:type="dxa" w:w="1567"/>
+          </w:tcPr>
+          <w:p>
+            <w:r>
+              <w:rPr>
+                <w:rFonts w:ascii="Times New Roman" w:hAnsi="Times New Roman"/>
+                <w:b w:val="0"/>
+                <w:i w:val="0"/>
+                <w:sz w:val="18"/>
+              </w:rPr>
+              <w:t>Dia 3</w:t>
+            </w:r>
+          </w:p>
+        </w:tc>
+        <w:tc>
+          <w:tcPr>
+            <w:tcW w:type="dxa" w:w="1567"/>
+          </w:tcPr>
+          <w:p>
+            <w:r>
+              <w:rPr>
+                <w:rFonts w:ascii="Times New Roman" w:hAnsi="Times New Roman"/>
+                <w:b w:val="0"/>
+                <w:i w:val="0"/>
+                <w:sz w:val="18"/>
+              </w:rPr>
+              <w:t>5,67</w:t>
+            </w:r>
+          </w:p>
+        </w:tc>
+        <w:tc>
+          <w:tcPr>
+            <w:tcW w:type="dxa" w:w="1567"/>
+          </w:tcPr>
+          <w:p>
+            <w:r>
+              <w:rPr>
+                <w:rFonts w:ascii="Times New Roman" w:hAnsi="Times New Roman"/>
+                <w:b w:val="0"/>
+                <w:i w:val="0"/>
+                <w:sz w:val="18"/>
+              </w:rPr>
+              <w:t>6,52</w:t>
+            </w:r>
+          </w:p>
+        </w:tc>
+        <w:tc>
+          <w:tcPr>
+            <w:tcW w:type="dxa" w:w="1567"/>
+          </w:tcPr>
+          <w:p>
+            <w:r>
+              <w:rPr>
+                <w:rFonts w:ascii="Times New Roman" w:hAnsi="Times New Roman"/>
+                <w:b w:val="0"/>
+                <w:i w:val="0"/>
+                <w:sz w:val="18"/>
+              </w:rPr>
+              <w:t>+0,86</w:t>
+            </w:r>
+          </w:p>
+        </w:tc>
+        <w:tc>
+          <w:tcPr>
+            <w:tcW w:type="dxa" w:w="1567"/>
+          </w:tcPr>
+          <w:p>
+            <w:r>
+              <w:rPr>
+                <w:rFonts w:ascii="Times New Roman" w:hAnsi="Times New Roman"/>
+                <w:b w:val="0"/>
+                <w:i w:val="0"/>
+                <w:sz w:val="18"/>
+              </w:rPr>
+              <w:t>+0,47</w:t>
+            </w:r>
+          </w:p>
+        </w:tc>
+        <w:tc>
+          <w:tcPr>
+            <w:tcW w:type="dxa" w:w="1567"/>
+          </w:tcPr>
+          <w:p>
+            <w:r>
+              <w:rPr>
+                <w:rFonts w:ascii="Times New Roman" w:hAnsi="Times New Roman"/>
+                <w:b w:val="0"/>
+                <w:i w:val="0"/>
+                <w:sz w:val="18"/>
+              </w:rPr>
+              <w:t>0,049*</w:t>
+            </w:r>
+          </w:p>
+        </w:tc>
+      </w:tr>
+      <w:tr>
+        <w:tc>
+          <w:tcPr>
+            <w:tcW w:type="dxa" w:w="1567"/>
+          </w:tcPr>
+          <w:p>
+            <w:r>
+              <w:rPr>
+                <w:rFonts w:ascii="Times New Roman" w:hAnsi="Times New Roman"/>
+                <w:b w:val="0"/>
+                <w:i w:val="0"/>
+                <w:sz w:val="18"/>
+              </w:rPr>
+              <w:t>Dia 4</w:t>
+            </w:r>
+          </w:p>
+        </w:tc>
+        <w:tc>
+          <w:tcPr>
+            <w:tcW w:type="dxa" w:w="1567"/>
+          </w:tcPr>
+          <w:p>
+            <w:r>
+              <w:rPr>
+                <w:rFonts w:ascii="Times New Roman" w:hAnsi="Times New Roman"/>
+                <w:b w:val="0"/>
+                <w:i w:val="0"/>
+                <w:sz w:val="18"/>
+              </w:rPr>
+              <w:t>5,72</w:t>
+            </w:r>
+          </w:p>
+        </w:tc>
+        <w:tc>
+          <w:tcPr>
+            <w:tcW w:type="dxa" w:w="1567"/>
+          </w:tcPr>
+          <w:p>
+            <w:r>
+              <w:rPr>
+                <w:rFonts w:ascii="Times New Roman" w:hAnsi="Times New Roman"/>
+                <w:b w:val="0"/>
+                <w:i w:val="0"/>
+                <w:sz w:val="18"/>
+              </w:rPr>
+              <w:t>7,33</w:t>
+            </w:r>
+          </w:p>
+        </w:tc>
+        <w:tc>
+          <w:tcPr>
+            <w:tcW w:type="dxa" w:w="1567"/>
+          </w:tcPr>
+          <w:p>
+            <w:r>
+              <w:rPr>
+                <w:rFonts w:ascii="Times New Roman" w:hAnsi="Times New Roman"/>
+                <w:b w:val="0"/>
+                <w:i w:val="0"/>
+                <w:sz w:val="18"/>
+              </w:rPr>
+              <w:t>+1,61</w:t>
+            </w:r>
+          </w:p>
+        </w:tc>
+        <w:tc>
+          <w:tcPr>
+            <w:tcW w:type="dxa" w:w="1567"/>
+          </w:tcPr>
+          <w:p>
+            <w:r>
+              <w:rPr>
+                <w:rFonts w:ascii="Times New Roman" w:hAnsi="Times New Roman"/>
+                <w:b w:val="0"/>
+                <w:i w:val="0"/>
+                <w:sz w:val="18"/>
+              </w:rPr>
+              <w:t>+0,79</w:t>
+            </w:r>
+          </w:p>
+        </w:tc>
+        <w:tc>
+          <w:tcPr>
+            <w:tcW w:type="dxa" w:w="1567"/>
+          </w:tcPr>
+          <w:p>
+            <w:r>
+              <w:rPr>
+                <w:rFonts w:ascii="Times New Roman" w:hAnsi="Times New Roman"/>
+                <w:b w:val="0"/>
+                <w:i w:val="0"/>
+                <w:sz w:val="18"/>
+              </w:rPr>
+              <w:t>0,004*</w:t>
+            </w:r>
+          </w:p>
+        </w:tc>
+      </w:tr>
+      <w:tr>
+        <w:tc>
+          <w:tcPr>
+            <w:tcW w:type="dxa" w:w="1567"/>
+          </w:tcPr>
+          <w:p>
+            <w:r>
+              <w:rPr>
+                <w:rFonts w:ascii="Times New Roman" w:hAnsi="Times New Roman"/>
+                <w:b w:val="0"/>
+                <w:i w:val="0"/>
+                <w:sz w:val="18"/>
+              </w:rPr>
+              <w:t>Dia 5</w:t>
+            </w:r>
+          </w:p>
+        </w:tc>
+        <w:tc>
+          <w:tcPr>
+            <w:tcW w:type="dxa" w:w="1567"/>
+          </w:tcPr>
+          <w:p>
+            <w:r>
+              <w:rPr>
+                <w:rFonts w:ascii="Times New Roman" w:hAnsi="Times New Roman"/>
+                <w:b w:val="0"/>
+                <w:i w:val="0"/>
+                <w:sz w:val="18"/>
+              </w:rPr>
+              <w:t>4,74</w:t>
+            </w:r>
+          </w:p>
+        </w:tc>
+        <w:tc>
+          <w:tcPr>
+            <w:tcW w:type="dxa" w:w="1567"/>
+          </w:tcPr>
+          <w:p>
+            <w:r>
+              <w:rPr>
+                <w:rFonts w:ascii="Times New Roman" w:hAnsi="Times New Roman"/>
+                <w:b w:val="0"/>
+                <w:i w:val="0"/>
+                <w:sz w:val="18"/>
+              </w:rPr>
+              <w:t>6,16</w:t>
+            </w:r>
+          </w:p>
+        </w:tc>
+        <w:tc>
+          <w:tcPr>
+            <w:tcW w:type="dxa" w:w="1567"/>
+          </w:tcPr>
+          <w:p>
+            <w:r>
+              <w:rPr>
+                <w:rFonts w:ascii="Times New Roman" w:hAnsi="Times New Roman"/>
+                <w:b w:val="0"/>
+                <w:i w:val="0"/>
+                <w:sz w:val="18"/>
+              </w:rPr>
+              <w:t>+1,42</w:t>
+            </w:r>
+          </w:p>
+        </w:tc>
+        <w:tc>
+          <w:tcPr>
+            <w:tcW w:type="dxa" w:w="1567"/>
+          </w:tcPr>
+          <w:p>
+            <w:r>
+              <w:rPr>
+                <w:rFonts w:ascii="Times New Roman" w:hAnsi="Times New Roman"/>
+                <w:b w:val="0"/>
+                <w:i w:val="0"/>
+                <w:sz w:val="18"/>
+              </w:rPr>
+              <w:t>+0,73</w:t>
+            </w:r>
+          </w:p>
+        </w:tc>
+        <w:tc>
+          <w:tcPr>
+            <w:tcW w:type="dxa" w:w="1567"/>
+          </w:tcPr>
+          <w:p>
+            <w:r>
+              <w:rPr>
+                <w:rFonts w:ascii="Times New Roman" w:hAnsi="Times New Roman"/>
+                <w:b w:val="0"/>
+                <w:i w:val="0"/>
+                <w:sz w:val="18"/>
+              </w:rPr>
+              <w:t>0,005*</w:t>
+            </w:r>
+          </w:p>
+        </w:tc>
+      </w:tr>
+      <w:tr>
+        <w:tc>
+          <w:tcPr>
+            <w:tcW w:type="dxa" w:w="1567"/>
+          </w:tcPr>
+          <w:p>
+            <w:r>
+              <w:rPr>
+                <w:rFonts w:ascii="Times New Roman" w:hAnsi="Times New Roman"/>
+                <w:b w:val="0"/>
+                <w:i w:val="0"/>
+                <w:sz w:val="18"/>
+              </w:rPr>
+              <w:t>Dia 6</w:t>
+            </w:r>
+          </w:p>
+        </w:tc>
+        <w:tc>
+          <w:tcPr>
+            <w:tcW w:type="dxa" w:w="1567"/>
+          </w:tcPr>
+          <w:p>
+            <w:r>
+              <w:rPr>
+                <w:rFonts w:ascii="Times New Roman" w:hAnsi="Times New Roman"/>
+                <w:b w:val="0"/>
+                <w:i w:val="0"/>
+                <w:sz w:val="18"/>
+              </w:rPr>
+              <w:t>5,65</w:t>
+            </w:r>
+          </w:p>
+        </w:tc>
+        <w:tc>
+          <w:tcPr>
+            <w:tcW w:type="dxa" w:w="1567"/>
+          </w:tcPr>
+          <w:p>
+            <w:r>
+              <w:rPr>
+                <w:rFonts w:ascii="Times New Roman" w:hAnsi="Times New Roman"/>
+                <w:b w:val="0"/>
+                <w:i w:val="0"/>
+                <w:sz w:val="18"/>
+              </w:rPr>
+              <w:t>6,75</w:t>
+            </w:r>
+          </w:p>
+        </w:tc>
+        <w:tc>
+          <w:tcPr>
+            <w:tcW w:type="dxa" w:w="1567"/>
+          </w:tcPr>
+          <w:p>
+            <w:r>
+              <w:rPr>
+                <w:rFonts w:ascii="Times New Roman" w:hAnsi="Times New Roman"/>
+                <w:b w:val="0"/>
+                <w:i w:val="0"/>
+                <w:sz w:val="18"/>
+              </w:rPr>
+              <w:t>+1,10</w:t>
+            </w:r>
+          </w:p>
+        </w:tc>
+        <w:tc>
+          <w:tcPr>
+            <w:tcW w:type="dxa" w:w="1567"/>
+          </w:tcPr>
+          <w:p>
+            <w:r>
+              <w:rPr>
+                <w:rFonts w:ascii="Times New Roman" w:hAnsi="Times New Roman"/>
+                <w:b w:val="0"/>
+                <w:i w:val="0"/>
+                <w:sz w:val="18"/>
+              </w:rPr>
+              <w:t>+0,51</w:t>
+            </w:r>
+          </w:p>
+        </w:tc>
+        <w:tc>
+          <w:tcPr>
+            <w:tcW w:type="dxa" w:w="1567"/>
+          </w:tcPr>
+          <w:p>
+            <w:r>
+              <w:rPr>
+                <w:rFonts w:ascii="Times New Roman" w:hAnsi="Times New Roman"/>
+                <w:b w:val="0"/>
+                <w:i w:val="0"/>
+                <w:sz w:val="18"/>
+              </w:rPr>
+              <w:t>0,042*</w:t>
+            </w:r>
+          </w:p>
+        </w:tc>
+      </w:tr>
+      <w:tr>
+        <w:tc>
+          <w:tcPr>
+            <w:tcW w:type="dxa" w:w="1567"/>
+          </w:tcPr>
+          <w:p>
+            <w:r>
+              <w:rPr>
+                <w:rFonts w:ascii="Times New Roman" w:hAnsi="Times New Roman"/>
+                <w:b w:val="0"/>
+                <w:i w:val="0"/>
+                <w:sz w:val="18"/>
+              </w:rPr>
+              <w:t>Dia 7</w:t>
+            </w:r>
+          </w:p>
+        </w:tc>
+        <w:tc>
+          <w:tcPr>
+            <w:tcW w:type="dxa" w:w="1567"/>
+          </w:tcPr>
+          <w:p>
+            <w:r>
+              <w:rPr>
+                <w:rFonts w:ascii="Times New Roman" w:hAnsi="Times New Roman"/>
+                <w:b w:val="0"/>
+                <w:i w:val="0"/>
+                <w:sz w:val="18"/>
+              </w:rPr>
+              <w:t>6,62</w:t>
+            </w:r>
+          </w:p>
+        </w:tc>
+        <w:tc>
+          <w:tcPr>
+            <w:tcW w:type="dxa" w:w="1567"/>
+          </w:tcPr>
+          <w:p>
+            <w:r>
+              <w:rPr>
+                <w:rFonts w:ascii="Times New Roman" w:hAnsi="Times New Roman"/>
+                <w:b w:val="0"/>
+                <w:i w:val="0"/>
+                <w:sz w:val="18"/>
+              </w:rPr>
+              <w:t>8,44</w:t>
+            </w:r>
+          </w:p>
+        </w:tc>
+        <w:tc>
+          <w:tcPr>
+            <w:tcW w:type="dxa" w:w="1567"/>
+          </w:tcPr>
+          <w:p>
+            <w:r>
+              <w:rPr>
+                <w:rFonts w:ascii="Times New Roman" w:hAnsi="Times New Roman"/>
+                <w:b w:val="0"/>
+                <w:i w:val="0"/>
+                <w:sz w:val="18"/>
+              </w:rPr>
+              <w:t>+1,81</w:t>
+            </w:r>
+          </w:p>
+        </w:tc>
+        <w:tc>
+          <w:tcPr>
+            <w:tcW w:type="dxa" w:w="1567"/>
+          </w:tcPr>
+          <w:p>
+            <w:r>
+              <w:rPr>
+                <w:rFonts w:ascii="Times New Roman" w:hAnsi="Times New Roman"/>
+                <w:b w:val="0"/>
+                <w:i w:val="0"/>
+                <w:sz w:val="18"/>
+              </w:rPr>
+              <w:t>+0,73</w:t>
+            </w:r>
+          </w:p>
+        </w:tc>
+        <w:tc>
+          <w:tcPr>
+            <w:tcW w:type="dxa" w:w="1567"/>
+          </w:tcPr>
+          <w:p>
+            <w:r>
+              <w:rPr>
+                <w:rFonts w:ascii="Times New Roman" w:hAnsi="Times New Roman"/>
+                <w:b w:val="0"/>
+                <w:i w:val="0"/>
+                <w:sz w:val="18"/>
+              </w:rPr>
+              <w:t>0,013*</w:t>
+            </w:r>
+          </w:p>
+        </w:tc>
+      </w:tr>
+    </w:tbl>
+    <w:p>
+      <w:pPr>
+        <w:spacing w:after="160" w:line="240" w:lineRule="auto"/>
+        <w:jc w:val="left"/>
+      </w:pPr>
+      <w:r>
+        <w:rPr>
+          <w:rFonts w:ascii="Times New Roman" w:hAnsi="Times New Roman"/>
+          <w:b w:val="0"/>
+          <w:i w:val="0"/>
+          <w:sz w:val="20"/>
+        </w:rPr>
+        <w:t>Fonte: Dados da pesquisa (2026).</w:t>
+      </w:r>
+    </w:p>
+    <w:p>
+      <w:pPr>
+        <w:spacing w:before="160" w:line="240" w:lineRule="auto"/>
+        <w:jc w:val="left"/>
+      </w:pPr>
+      <w:r>
+        <w:rPr>
+          <w:rFonts w:ascii="Times New Roman" w:hAnsi="Times New Roman"/>
+          <w:b w:val="0"/>
+          <w:i w:val="0"/>
+          <w:sz w:val="20"/>
+        </w:rPr>
+        <w:t>Tabela 8 – Fadiga mental: resposta pré→pós por dia (* p &lt; 0,05)</w:t>
+      </w:r>
+    </w:p>
+    <w:tbl>
+      <w:tblPr>
+        <w:tblW w:type="auto" w:w="0"/>
+        <w:jc w:val="center"/>
+        <w:tblLook w:firstColumn="1" w:firstRow="1" w:lastColumn="0" w:lastRow="0" w:noHBand="0" w:noVBand="1" w:val="04A0"/>
+        <w:tblBorders>
+          <w:top w:val="single" w:sz="6" w:space="0" w:color="000000"/>
+          <w:bottom w:val="single" w:sz="6" w:space="0" w:color="000000"/>
+          <w:insideH w:val="single" w:sz="6" w:space="0" w:color="000000"/>
+          <w:left w:val="none"/>
+          <w:right w:val="none"/>
+          <w:insideV w:val="none"/>
+        </w:tblBorders>
+      </w:tblPr>
+      <w:tblGrid>
+        <w:gridCol w:w="1567"/>
+        <w:gridCol w:w="1567"/>
+        <w:gridCol w:w="1567"/>
+        <w:gridCol w:w="1567"/>
+        <w:gridCol w:w="1567"/>
+        <w:gridCol w:w="1567"/>
+      </w:tblGrid>
+      <w:tr>
+        <w:tc>
+          <w:tcPr>
+            <w:tcW w:type="dxa" w:w="1567"/>
+          </w:tcPr>
+          <w:p>
+            <w:r>
+              <w:rPr>
+                <w:rFonts w:ascii="Times New Roman" w:hAnsi="Times New Roman"/>
+                <w:b/>
+                <w:i w:val="0"/>
+                <w:sz w:val="18"/>
+              </w:rPr>
+              <w:t>Dia</w:t>
+            </w:r>
+          </w:p>
+        </w:tc>
+        <w:tc>
+          <w:tcPr>
+            <w:tcW w:type="dxa" w:w="1567"/>
+          </w:tcPr>
+          <w:p>
+            <w:r>
+              <w:rPr>
+                <w:rFonts w:ascii="Times New Roman" w:hAnsi="Times New Roman"/>
+                <w:b/>
+                <w:i w:val="0"/>
+                <w:sz w:val="18"/>
+              </w:rPr>
+              <w:t>Pré</w:t>
+            </w:r>
+          </w:p>
+        </w:tc>
+        <w:tc>
+          <w:tcPr>
+            <w:tcW w:type="dxa" w:w="1567"/>
+          </w:tcPr>
+          <w:p>
+            <w:r>
+              <w:rPr>
+                <w:rFonts w:ascii="Times New Roman" w:hAnsi="Times New Roman"/>
+                <w:b/>
+                <w:i w:val="0"/>
+                <w:sz w:val="18"/>
+              </w:rPr>
+              <w:t>Pós</w:t>
+            </w:r>
+          </w:p>
+        </w:tc>
+        <w:tc>
+          <w:tcPr>
+            <w:tcW w:type="dxa" w:w="1567"/>
+          </w:tcPr>
+          <w:p>
+            <w:r>
+              <w:rPr>
+                <w:rFonts w:ascii="Times New Roman" w:hAnsi="Times New Roman"/>
+                <w:b/>
+                <w:i w:val="0"/>
+                <w:sz w:val="18"/>
+              </w:rPr>
+              <w:t>Δ (pós−pré)</w:t>
+            </w:r>
+          </w:p>
+        </w:tc>
+        <w:tc>
+          <w:tcPr>
+            <w:tcW w:type="dxa" w:w="1567"/>
+          </w:tcPr>
+          <w:p>
+            <w:r>
+              <w:rPr>
+                <w:rFonts w:ascii="Times New Roman" w:hAnsi="Times New Roman"/>
+                <w:b/>
+                <w:i w:val="0"/>
+                <w:sz w:val="18"/>
+              </w:rPr>
+              <w:t>dz</w:t>
+            </w:r>
+          </w:p>
+        </w:tc>
+        <w:tc>
+          <w:tcPr>
+            <w:tcW w:type="dxa" w:w="1567"/>
+          </w:tcPr>
+          <w:p>
+            <w:r>
+              <w:rPr>
+                <w:rFonts w:ascii="Times New Roman" w:hAnsi="Times New Roman"/>
+                <w:b/>
+                <w:i w:val="0"/>
+                <w:sz w:val="18"/>
+              </w:rPr>
+              <w:t>p</w:t>
+            </w:r>
+          </w:p>
+        </w:tc>
+      </w:tr>
+      <w:tr>
+        <w:tc>
+          <w:tcPr>
+            <w:tcW w:type="dxa" w:w="1567"/>
+          </w:tcPr>
+          <w:p>
+            <w:r>
+              <w:rPr>
+                <w:rFonts w:ascii="Times New Roman" w:hAnsi="Times New Roman"/>
+                <w:b w:val="0"/>
+                <w:i w:val="0"/>
+                <w:sz w:val="18"/>
+              </w:rPr>
+              <w:t>Dia 1</w:t>
+            </w:r>
+          </w:p>
+        </w:tc>
+        <w:tc>
+          <w:tcPr>
+            <w:tcW w:type="dxa" w:w="1567"/>
+          </w:tcPr>
+          <w:p>
+            <w:r>
+              <w:rPr>
+                <w:rFonts w:ascii="Times New Roman" w:hAnsi="Times New Roman"/>
+                <w:b w:val="0"/>
+                <w:i w:val="0"/>
+                <w:sz w:val="18"/>
+              </w:rPr>
+              <w:t>4,47</w:t>
+            </w:r>
+          </w:p>
+        </w:tc>
+        <w:tc>
+          <w:tcPr>
+            <w:tcW w:type="dxa" w:w="1567"/>
+          </w:tcPr>
+          <w:p>
+            <w:r>
+              <w:rPr>
+                <w:rFonts w:ascii="Times New Roman" w:hAnsi="Times New Roman"/>
+                <w:b w:val="0"/>
+                <w:i w:val="0"/>
+                <w:sz w:val="18"/>
+              </w:rPr>
+              <w:t>5,80</w:t>
+            </w:r>
+          </w:p>
+        </w:tc>
+        <w:tc>
+          <w:tcPr>
+            <w:tcW w:type="dxa" w:w="1567"/>
+          </w:tcPr>
+          <w:p>
+            <w:r>
+              <w:rPr>
+                <w:rFonts w:ascii="Times New Roman" w:hAnsi="Times New Roman"/>
+                <w:b w:val="0"/>
+                <w:i w:val="0"/>
+                <w:sz w:val="18"/>
+              </w:rPr>
+              <w:t>+1,33</w:t>
+            </w:r>
+          </w:p>
+        </w:tc>
+        <w:tc>
+          <w:tcPr>
+            <w:tcW w:type="dxa" w:w="1567"/>
+          </w:tcPr>
+          <w:p>
+            <w:r>
+              <w:rPr>
+                <w:rFonts w:ascii="Times New Roman" w:hAnsi="Times New Roman"/>
+                <w:b w:val="0"/>
+                <w:i w:val="0"/>
+                <w:sz w:val="18"/>
+              </w:rPr>
+              <w:t>+0,70</w:t>
+            </w:r>
+          </w:p>
+        </w:tc>
+        <w:tc>
+          <w:tcPr>
+            <w:tcW w:type="dxa" w:w="1567"/>
+          </w:tcPr>
+          <w:p>
+            <w:r>
+              <w:rPr>
+                <w:rFonts w:ascii="Times New Roman" w:hAnsi="Times New Roman"/>
+                <w:b w:val="0"/>
+                <w:i w:val="0"/>
+                <w:sz w:val="18"/>
+              </w:rPr>
+              <w:t>0,021*</w:t>
+            </w:r>
+          </w:p>
+        </w:tc>
+      </w:tr>
+      <w:tr>
+        <w:tc>
+          <w:tcPr>
+            <w:tcW w:type="dxa" w:w="1567"/>
+          </w:tcPr>
+          <w:p>
+            <w:r>
+              <w:rPr>
+                <w:rFonts w:ascii="Times New Roman" w:hAnsi="Times New Roman"/>
+                <w:b w:val="0"/>
+                <w:i w:val="0"/>
+                <w:sz w:val="18"/>
+              </w:rPr>
+              <w:t>Dia 2</w:t>
+            </w:r>
+          </w:p>
+        </w:tc>
+        <w:tc>
+          <w:tcPr>
+            <w:tcW w:type="dxa" w:w="1567"/>
+          </w:tcPr>
+          <w:p>
+            <w:r>
+              <w:rPr>
+                <w:rFonts w:ascii="Times New Roman" w:hAnsi="Times New Roman"/>
+                <w:b w:val="0"/>
+                <w:i w:val="0"/>
+                <w:sz w:val="18"/>
+              </w:rPr>
+              <w:t>4,31</w:t>
+            </w:r>
+          </w:p>
+        </w:tc>
+        <w:tc>
+          <w:tcPr>
+            <w:tcW w:type="dxa" w:w="1567"/>
+          </w:tcPr>
+          <w:p>
+            <w:r>
+              <w:rPr>
+                <w:rFonts w:ascii="Times New Roman" w:hAnsi="Times New Roman"/>
+                <w:b w:val="0"/>
+                <w:i w:val="0"/>
+                <w:sz w:val="18"/>
+              </w:rPr>
+              <w:t>4,73</w:t>
+            </w:r>
+          </w:p>
+        </w:tc>
+        <w:tc>
+          <w:tcPr>
+            <w:tcW w:type="dxa" w:w="1567"/>
+          </w:tcPr>
+          <w:p>
+            <w:r>
+              <w:rPr>
+                <w:rFonts w:ascii="Times New Roman" w:hAnsi="Times New Roman"/>
+                <w:b w:val="0"/>
+                <w:i w:val="0"/>
+                <w:sz w:val="18"/>
+              </w:rPr>
+              <w:t>+0,42</w:t>
+            </w:r>
+          </w:p>
+        </w:tc>
+        <w:tc>
+          <w:tcPr>
+            <w:tcW w:type="dxa" w:w="1567"/>
+          </w:tcPr>
+          <w:p>
+            <w:r>
+              <w:rPr>
+                <w:rFonts w:ascii="Times New Roman" w:hAnsi="Times New Roman"/>
+                <w:b w:val="0"/>
+                <w:i w:val="0"/>
+                <w:sz w:val="18"/>
+              </w:rPr>
+              <w:t>+0,20</w:t>
+            </w:r>
+          </w:p>
+        </w:tc>
+        <w:tc>
+          <w:tcPr>
+            <w:tcW w:type="dxa" w:w="1567"/>
+          </w:tcPr>
+          <w:p>
+            <w:r>
+              <w:rPr>
+                <w:rFonts w:ascii="Times New Roman" w:hAnsi="Times New Roman"/>
+                <w:b w:val="0"/>
+                <w:i w:val="0"/>
+                <w:sz w:val="18"/>
+              </w:rPr>
+              <w:t>0,487</w:t>
+            </w:r>
+          </w:p>
+        </w:tc>
+      </w:tr>
+      <w:tr>
+        <w:tc>
+          <w:tcPr>
+            <w:tcW w:type="dxa" w:w="1567"/>
+          </w:tcPr>
+          <w:p>
+            <w:r>
+              <w:rPr>
+                <w:rFonts w:ascii="Times New Roman" w:hAnsi="Times New Roman"/>
+                <w:b w:val="0"/>
+                <w:i w:val="0"/>
+                <w:sz w:val="18"/>
+              </w:rPr>
+              <w:t>Dia 3</w:t>
+            </w:r>
+          </w:p>
+        </w:tc>
+        <w:tc>
+          <w:tcPr>
+            <w:tcW w:type="dxa" w:w="1567"/>
+          </w:tcPr>
+          <w:p>
+            <w:r>
+              <w:rPr>
+                <w:rFonts w:ascii="Times New Roman" w:hAnsi="Times New Roman"/>
+                <w:b w:val="0"/>
+                <w:i w:val="0"/>
+                <w:sz w:val="18"/>
+              </w:rPr>
+              <w:t>4,52</w:t>
+            </w:r>
+          </w:p>
+        </w:tc>
+        <w:tc>
+          <w:tcPr>
+            <w:tcW w:type="dxa" w:w="1567"/>
+          </w:tcPr>
+          <w:p>
+            <w:r>
+              <w:rPr>
+                <w:rFonts w:ascii="Times New Roman" w:hAnsi="Times New Roman"/>
+                <w:b w:val="0"/>
+                <w:i w:val="0"/>
+                <w:sz w:val="18"/>
+              </w:rPr>
+              <w:t>4,19</w:t>
+            </w:r>
+          </w:p>
+        </w:tc>
+        <w:tc>
+          <w:tcPr>
+            <w:tcW w:type="dxa" w:w="1567"/>
+          </w:tcPr>
+          <w:p>
+            <w:r>
+              <w:rPr>
+                <w:rFonts w:ascii="Times New Roman" w:hAnsi="Times New Roman"/>
+                <w:b w:val="0"/>
+                <w:i w:val="0"/>
+                <w:sz w:val="18"/>
+              </w:rPr>
+              <w:t>-0,33</w:t>
+            </w:r>
+          </w:p>
+        </w:tc>
+        <w:tc>
+          <w:tcPr>
+            <w:tcW w:type="dxa" w:w="1567"/>
+          </w:tcPr>
+          <w:p>
+            <w:r>
+              <w:rPr>
+                <w:rFonts w:ascii="Times New Roman" w:hAnsi="Times New Roman"/>
+                <w:b w:val="0"/>
+                <w:i w:val="0"/>
+                <w:sz w:val="18"/>
+              </w:rPr>
+              <w:t>-0,16</w:t>
+            </w:r>
+          </w:p>
+        </w:tc>
+        <w:tc>
+          <w:tcPr>
+            <w:tcW w:type="dxa" w:w="1567"/>
+          </w:tcPr>
+          <w:p>
+            <w:r>
+              <w:rPr>
+                <w:rFonts w:ascii="Times New Roman" w:hAnsi="Times New Roman"/>
+                <w:b w:val="0"/>
+                <w:i w:val="0"/>
+                <w:sz w:val="18"/>
+              </w:rPr>
+              <w:t>0,274</w:t>
+            </w:r>
+          </w:p>
+        </w:tc>
+      </w:tr>
+      <w:tr>
+        <w:tc>
+          <w:tcPr>
+            <w:tcW w:type="dxa" w:w="1567"/>
+          </w:tcPr>
+          <w:p>
+            <w:r>
+              <w:rPr>
+                <w:rFonts w:ascii="Times New Roman" w:hAnsi="Times New Roman"/>
+                <w:b w:val="0"/>
+                <w:i w:val="0"/>
+                <w:sz w:val="18"/>
+              </w:rPr>
+              <w:t>Dia 4</w:t>
+            </w:r>
+          </w:p>
+        </w:tc>
+        <w:tc>
+          <w:tcPr>
+            <w:tcW w:type="dxa" w:w="1567"/>
+          </w:tcPr>
+          <w:p>
+            <w:r>
+              <w:rPr>
+                <w:rFonts w:ascii="Times New Roman" w:hAnsi="Times New Roman"/>
+                <w:b w:val="0"/>
+                <w:i w:val="0"/>
+                <w:sz w:val="18"/>
+              </w:rPr>
+              <w:t>4,56</w:t>
+            </w:r>
+          </w:p>
+        </w:tc>
+        <w:tc>
+          <w:tcPr>
+            <w:tcW w:type="dxa" w:w="1567"/>
+          </w:tcPr>
+          <w:p>
+            <w:r>
+              <w:rPr>
+                <w:rFonts w:ascii="Times New Roman" w:hAnsi="Times New Roman"/>
+                <w:b w:val="0"/>
+                <w:i w:val="0"/>
+                <w:sz w:val="18"/>
+              </w:rPr>
+              <w:t>5,22</w:t>
+            </w:r>
+          </w:p>
+        </w:tc>
+        <w:tc>
+          <w:tcPr>
+            <w:tcW w:type="dxa" w:w="1567"/>
+          </w:tcPr>
+          <w:p>
+            <w:r>
+              <w:rPr>
+                <w:rFonts w:ascii="Times New Roman" w:hAnsi="Times New Roman"/>
+                <w:b w:val="0"/>
+                <w:i w:val="0"/>
+                <w:sz w:val="18"/>
+              </w:rPr>
+              <w:t>+0,67</w:t>
+            </w:r>
+          </w:p>
+        </w:tc>
+        <w:tc>
+          <w:tcPr>
+            <w:tcW w:type="dxa" w:w="1567"/>
+          </w:tcPr>
+          <w:p>
+            <w:r>
+              <w:rPr>
+                <w:rFonts w:ascii="Times New Roman" w:hAnsi="Times New Roman"/>
+                <w:b w:val="0"/>
+                <w:i w:val="0"/>
+                <w:sz w:val="18"/>
+              </w:rPr>
+              <w:t>+0,29</w:t>
+            </w:r>
+          </w:p>
+        </w:tc>
+        <w:tc>
+          <w:tcPr>
+            <w:tcW w:type="dxa" w:w="1567"/>
+          </w:tcPr>
+          <w:p>
+            <w:r>
+              <w:rPr>
+                <w:rFonts w:ascii="Times New Roman" w:hAnsi="Times New Roman"/>
+                <w:b w:val="0"/>
+                <w:i w:val="0"/>
+                <w:sz w:val="18"/>
+              </w:rPr>
+              <w:t>0,275</w:t>
+            </w:r>
+          </w:p>
+        </w:tc>
+      </w:tr>
+      <w:tr>
+        <w:tc>
+          <w:tcPr>
+            <w:tcW w:type="dxa" w:w="1567"/>
+          </w:tcPr>
+          <w:p>
+            <w:r>
+              <w:rPr>
+                <w:rFonts w:ascii="Times New Roman" w:hAnsi="Times New Roman"/>
+                <w:b w:val="0"/>
+                <w:i w:val="0"/>
+                <w:sz w:val="18"/>
+              </w:rPr>
+              <w:t>Dia 5</w:t>
+            </w:r>
+          </w:p>
+        </w:tc>
+        <w:tc>
+          <w:tcPr>
+            <w:tcW w:type="dxa" w:w="1567"/>
+          </w:tcPr>
+          <w:p>
+            <w:r>
+              <w:rPr>
+                <w:rFonts w:ascii="Times New Roman" w:hAnsi="Times New Roman"/>
+                <w:b w:val="0"/>
+                <w:i w:val="0"/>
+                <w:sz w:val="18"/>
+              </w:rPr>
+              <w:t>3,84</w:t>
+            </w:r>
+          </w:p>
+        </w:tc>
+        <w:tc>
+          <w:tcPr>
+            <w:tcW w:type="dxa" w:w="1567"/>
+          </w:tcPr>
+          <w:p>
+            <w:r>
+              <w:rPr>
+                <w:rFonts w:ascii="Times New Roman" w:hAnsi="Times New Roman"/>
+                <w:b w:val="0"/>
+                <w:i w:val="0"/>
+                <w:sz w:val="18"/>
+              </w:rPr>
+              <w:t>4,37</w:t>
+            </w:r>
+          </w:p>
+        </w:tc>
+        <w:tc>
+          <w:tcPr>
+            <w:tcW w:type="dxa" w:w="1567"/>
+          </w:tcPr>
+          <w:p>
+            <w:r>
+              <w:rPr>
+                <w:rFonts w:ascii="Times New Roman" w:hAnsi="Times New Roman"/>
+                <w:b w:val="0"/>
+                <w:i w:val="0"/>
+                <w:sz w:val="18"/>
+              </w:rPr>
+              <w:t>+0,53</w:t>
+            </w:r>
+          </w:p>
+        </w:tc>
+        <w:tc>
+          <w:tcPr>
+            <w:tcW w:type="dxa" w:w="1567"/>
+          </w:tcPr>
+          <w:p>
+            <w:r>
+              <w:rPr>
+                <w:rFonts w:ascii="Times New Roman" w:hAnsi="Times New Roman"/>
+                <w:b w:val="0"/>
+                <w:i w:val="0"/>
+                <w:sz w:val="18"/>
+              </w:rPr>
+              <w:t>+0,23</w:t>
+            </w:r>
+          </w:p>
+        </w:tc>
+        <w:tc>
+          <w:tcPr>
+            <w:tcW w:type="dxa" w:w="1567"/>
+          </w:tcPr>
+          <w:p>
+            <w:r>
+              <w:rPr>
+                <w:rFonts w:ascii="Times New Roman" w:hAnsi="Times New Roman"/>
+                <w:b w:val="0"/>
+                <w:i w:val="0"/>
+                <w:sz w:val="18"/>
+              </w:rPr>
+              <w:t>0,473</w:t>
+            </w:r>
+          </w:p>
+        </w:tc>
+      </w:tr>
+      <w:tr>
+        <w:tc>
+          <w:tcPr>
+            <w:tcW w:type="dxa" w:w="1567"/>
+          </w:tcPr>
+          <w:p>
+            <w:r>
+              <w:rPr>
+                <w:rFonts w:ascii="Times New Roman" w:hAnsi="Times New Roman"/>
+                <w:b w:val="0"/>
+                <w:i w:val="0"/>
+                <w:sz w:val="18"/>
+              </w:rPr>
+              <w:t>Dia 6</w:t>
+            </w:r>
+          </w:p>
+        </w:tc>
+        <w:tc>
+          <w:tcPr>
+            <w:tcW w:type="dxa" w:w="1567"/>
+          </w:tcPr>
+          <w:p>
+            <w:r>
+              <w:rPr>
+                <w:rFonts w:ascii="Times New Roman" w:hAnsi="Times New Roman"/>
+                <w:b w:val="0"/>
+                <w:i w:val="0"/>
+                <w:sz w:val="18"/>
+              </w:rPr>
+              <w:t>4,35</w:t>
+            </w:r>
+          </w:p>
+        </w:tc>
+        <w:tc>
+          <w:tcPr>
+            <w:tcW w:type="dxa" w:w="1567"/>
+          </w:tcPr>
+          <w:p>
+            <w:r>
+              <w:rPr>
+                <w:rFonts w:ascii="Times New Roman" w:hAnsi="Times New Roman"/>
+                <w:b w:val="0"/>
+                <w:i w:val="0"/>
+                <w:sz w:val="18"/>
+              </w:rPr>
+              <w:t>5,20</w:t>
+            </w:r>
+          </w:p>
+        </w:tc>
+        <w:tc>
+          <w:tcPr>
+            <w:tcW w:type="dxa" w:w="1567"/>
+          </w:tcPr>
+          <w:p>
+            <w:r>
+              <w:rPr>
+                <w:rFonts w:ascii="Times New Roman" w:hAnsi="Times New Roman"/>
+                <w:b w:val="0"/>
+                <w:i w:val="0"/>
+                <w:sz w:val="18"/>
+              </w:rPr>
+              <w:t>+0,85</w:t>
+            </w:r>
+          </w:p>
+        </w:tc>
+        <w:tc>
+          <w:tcPr>
+            <w:tcW w:type="dxa" w:w="1567"/>
+          </w:tcPr>
+          <w:p>
+            <w:r>
+              <w:rPr>
+                <w:rFonts w:ascii="Times New Roman" w:hAnsi="Times New Roman"/>
+                <w:b w:val="0"/>
+                <w:i w:val="0"/>
+                <w:sz w:val="18"/>
+              </w:rPr>
+              <w:t>+0,37</w:t>
+            </w:r>
+          </w:p>
+        </w:tc>
+        <w:tc>
+          <w:tcPr>
+            <w:tcW w:type="dxa" w:w="1567"/>
+          </w:tcPr>
+          <w:p>
+            <w:r>
+              <w:rPr>
+                <w:rFonts w:ascii="Times New Roman" w:hAnsi="Times New Roman"/>
+                <w:b w:val="0"/>
+                <w:i w:val="0"/>
+                <w:sz w:val="18"/>
+              </w:rPr>
+              <w:t>0,084</w:t>
+            </w:r>
+          </w:p>
+        </w:tc>
+      </w:tr>
+      <w:tr>
+        <w:tc>
+          <w:tcPr>
+            <w:tcW w:type="dxa" w:w="1567"/>
+          </w:tcPr>
+          <w:p>
+            <w:r>
+              <w:rPr>
+                <w:rFonts w:ascii="Times New Roman" w:hAnsi="Times New Roman"/>
+                <w:b w:val="0"/>
+                <w:i w:val="0"/>
+                <w:sz w:val="18"/>
+              </w:rPr>
+              <w:t>Dia 7</w:t>
+            </w:r>
+          </w:p>
+        </w:tc>
+        <w:tc>
+          <w:tcPr>
+            <w:tcW w:type="dxa" w:w="1567"/>
+          </w:tcPr>
+          <w:p>
+            <w:r>
+              <w:rPr>
+                <w:rFonts w:ascii="Times New Roman" w:hAnsi="Times New Roman"/>
+                <w:b w:val="0"/>
+                <w:i w:val="0"/>
+                <w:sz w:val="18"/>
+              </w:rPr>
+              <w:t>4,69</w:t>
+            </w:r>
+          </w:p>
+        </w:tc>
+        <w:tc>
+          <w:tcPr>
+            <w:tcW w:type="dxa" w:w="1567"/>
+          </w:tcPr>
+          <w:p>
+            <w:r>
+              <w:rPr>
+                <w:rFonts w:ascii="Times New Roman" w:hAnsi="Times New Roman"/>
+                <w:b w:val="0"/>
+                <w:i w:val="0"/>
+                <w:sz w:val="18"/>
+              </w:rPr>
+              <w:t>5,56</w:t>
+            </w:r>
+          </w:p>
+        </w:tc>
+        <w:tc>
+          <w:tcPr>
+            <w:tcW w:type="dxa" w:w="1567"/>
+          </w:tcPr>
+          <w:p>
+            <w:r>
+              <w:rPr>
+                <w:rFonts w:ascii="Times New Roman" w:hAnsi="Times New Roman"/>
+                <w:b w:val="0"/>
+                <w:i w:val="0"/>
+                <w:sz w:val="18"/>
+              </w:rPr>
+              <w:t>+0,88</w:t>
+            </w:r>
+          </w:p>
+        </w:tc>
+        <w:tc>
+          <w:tcPr>
+            <w:tcW w:type="dxa" w:w="1567"/>
+          </w:tcPr>
+          <w:p>
+            <w:r>
+              <w:rPr>
+                <w:rFonts w:ascii="Times New Roman" w:hAnsi="Times New Roman"/>
+                <w:b w:val="0"/>
+                <w:i w:val="0"/>
+                <w:sz w:val="18"/>
+              </w:rPr>
+              <w:t>+0,57</w:t>
+            </w:r>
+          </w:p>
+        </w:tc>
+        <w:tc>
+          <w:tcPr>
+            <w:tcW w:type="dxa" w:w="1567"/>
+          </w:tcPr>
+          <w:p>
+            <w:r>
+              <w:rPr>
+                <w:rFonts w:ascii="Times New Roman" w:hAnsi="Times New Roman"/>
+                <w:b w:val="0"/>
+                <w:i w:val="0"/>
+                <w:sz w:val="18"/>
+              </w:rPr>
+              <w:t>0,043*</w:t>
+            </w:r>
+          </w:p>
+        </w:tc>
+      </w:tr>
+    </w:tbl>
+    <w:p>
+      <w:pPr>
+        <w:spacing w:after="160" w:line="240" w:lineRule="auto"/>
+        <w:jc w:val="left"/>
+      </w:pPr>
+      <w:r>
+        <w:rPr>
+          <w:rFonts w:ascii="Times New Roman" w:hAnsi="Times New Roman"/>
+          <w:b w:val="0"/>
+          <w:i w:val="0"/>
+          <w:sz w:val="20"/>
+        </w:rPr>
+        <w:t>Fonte: Dados da pesquisa (2026).</w:t>
       </w:r>
     </w:p>
     <w:p>
@@ -3111,7 +6459,7 @@
           <w:i w:val="0"/>
           <w:sz w:val="20"/>
         </w:rPr>
-        <w:t>Tabela 5 – Sensibilidade/responsividade das variáveis (ordenado pelo efeito crônico)</w:t>
+        <w:t>Tabela 9 – Sensibilidade/responsividade das variáveis (ordenado pelo efeito crônico)</w:t>
       </w:r>
     </w:p>
     <w:tbl>
@@ -3673,7 +7021,7 @@
           <w:i w:val="0"/>
           <w:sz w:val="20"/>
         </w:rPr>
-        <w:t>Tabela 6 – Limites, derivadas (velocidade no D1 e D7) e ponto de inflexão por variável</w:t>
+        <w:t>Tabela 10 – Limites, derivadas (velocidade no D1 e D7) e ponto de inflexão por variável</w:t>
       </w:r>
     </w:p>
     <w:tbl>
@@ -4511,7 +7859,7 @@
           <w:i w:val="0"/>
           <w:sz w:val="20"/>
         </w:rPr>
-        <w:t>Tabela 7 – Decomposição da variância (sinal da semana, traço e ruído) e limiares de medida</w:t>
+        <w:t>Tabela 11 – Decomposição da variância (sinal da semana, traço e ruído) e limiares de medida</w:t>
       </w:r>
     </w:p>
     <w:tbl>
@@ -5304,7 +8652,7 @@
           <w:i w:val="0"/>
           <w:sz w:val="20"/>
         </w:rPr>
-        <w:t>Tabela 8 – Distribuição dos seis perfis de humor (%) em dias-chave</w:t>
+        <w:t>Tabela 12 – Distribuição dos seis perfis de humor (%) em dias-chave</w:t>
       </w:r>
     </w:p>
     <w:tbl>

</xml_diff>

<commit_message>
Restore individual analyses: dedicated section 4.6 + individual pré/pós figure
Keeps the individual-level analyses in the week article. Adds a dedicated
subsection "4.6 Comportamento individual entre atletas" consolidating the
per-athlete amplitude heatmap (Figura 3), the individual weekly trajectories
(Figura 6) and a restored individual pré→pós response figure (Figura 7, each
line an athlete) — the individual acute-response analysis from the original
descriptive report. Now 5 tables, 6 gráficos, 7 figuras (~10 pages).

Reproducible: scripts/analise/build_semana_v3.py, sem_fig_individual.py.
Athletes anonymized; no raw data committed.

Co-Authored-By: Claude Opus 4.8 <noreply@anthropic.com>
Claude-Session: https://claude.ai/code/session_01P7yGiDeoGDyjWvPWQVsUrj
</commit_message>
<xml_diff>
--- a/Artigos/Perfil_Humor_Semana_PreTemporada_ABNT.docx
+++ b/Artigos/Perfil_Humor_Semana_PreTemporada_ABNT.docx
@@ -3174,7 +3174,7 @@
           <w:i w:val="0"/>
           <w:sz w:val="24"/>
         </w:rPr>
-        <w:t>4.5 Perfil iceberg, comportamento individual e ponto de inflexão</w:t>
+        <w:t>4.5 Perfil iceberg e ponto de inflexão</w:t>
       </w:r>
     </w:p>
     <w:p>
@@ -3190,7 +3190,7 @@
           <w:i w:val="0"/>
           <w:sz w:val="24"/>
         </w:rPr>
-        <w:t>Os seis perfis de humor (Figura 4) descrevem as configurações possíveis do estado afetivo; ao longo da semana observou-se a migração do perfil saudável (iceberg) para o de fadiga, com queda do percentual em perfil iceberg e do índice-iceberg e precipitação no Dia 7 (Gráfico 6). As trajetórias individuais (Figura 5) confirmam a direção compartilhada, porém com magnitude e ponto de partida variáveis entre atletas, o que desaconselha pontos de corte normativos únicos. A leitura das derivadas (Figura 6) descreve a forma da mudança: a aceleração troca de sinal uma única vez — o ponto de inflexão —, situado em torno do Dia 4 para o vigor, a fadiga física e a fadiga do BRUMS, marcando a transição da fase de acomodação para o aprofundamento da fadiga rumo ao Dia 7 e delimitando a janela oportuna para a intervenção na recuperação.</w:t>
+        <w:t>Os seis perfis de humor (Figura 4) descrevem as configurações possíveis do estado afetivo; ao longo da semana observou-se a migração do perfil saudável (iceberg) para o de fadiga, com queda do percentual em perfil iceberg e do índice-iceberg e precipitação no Dia 7 (Gráfico 6). A leitura das derivadas (Figura 5) descreve a forma da mudança: a aceleração troca de sinal uma única vez — o ponto de inflexão —, situado em torno do Dia 4 para o vigor, a fadiga física e a fadiga do BRUMS, marcando a transição da fase de acomodação para o aprofundamento da fadiga rumo ao Dia 7 e delimitando a janela oportuna para a intervenção na recuperação.</w:t>
       </w:r>
     </w:p>
     <w:p>
@@ -3343,7 +3343,107 @@
           <w:i w:val="0"/>
           <w:sz w:val="20"/>
         </w:rPr>
-        <w:t>Figura 5 – Trajetórias individuais do vigor e da fadiga física ao longo da semana (linha em destaque = média do grupo)</w:t>
+        <w:t>Figura 5 – Velocidade (linha cheia) e aceleração (tracejada) da trajetória de cada variável; linha vertical = ponto de inflexão</w:t>
+      </w:r>
+    </w:p>
+    <w:p>
+      <w:pPr>
+        <w:jc w:val="center"/>
+      </w:pPr>
+      <w:r>
+        <w:drawing>
+          <wp:inline xmlns:a="http://schemas.openxmlformats.org/drawingml/2006/main" xmlns:pic="http://schemas.openxmlformats.org/drawingml/2006/picture">
+            <wp:extent cx="4572000" cy="2571750"/>
+            <wp:docPr id="11" name="Picture 11"/>
+            <wp:cNvGraphicFramePr>
+              <a:graphicFrameLocks noChangeAspect="1"/>
+            </wp:cNvGraphicFramePr>
+            <a:graphic>
+              <a:graphicData uri="http://schemas.openxmlformats.org/drawingml/2006/picture">
+                <pic:pic>
+                  <pic:nvPicPr>
+                    <pic:cNvPr id="0" name="sem_f_derivadas.png"/>
+                    <pic:cNvPicPr/>
+                  </pic:nvPicPr>
+                  <pic:blipFill>
+                    <a:blip r:embed="rId19"/>
+                    <a:stretch>
+                      <a:fillRect/>
+                    </a:stretch>
+                  </pic:blipFill>
+                  <pic:spPr>
+                    <a:xfrm>
+                      <a:off x="0" y="0"/>
+                      <a:ext cx="4572000" cy="2571750"/>
+                    </a:xfrm>
+                    <a:prstGeom prst="rect"/>
+                  </pic:spPr>
+                </pic:pic>
+              </a:graphicData>
+            </a:graphic>
+          </wp:inline>
+        </w:drawing>
+      </w:r>
+    </w:p>
+    <w:p>
+      <w:pPr>
+        <w:spacing w:after="120" w:line="240" w:lineRule="auto"/>
+        <w:jc w:val="center"/>
+      </w:pPr>
+      <w:r>
+        <w:rPr>
+          <w:rFonts w:ascii="Times New Roman" w:hAnsi="Times New Roman"/>
+          <w:b w:val="0"/>
+          <w:i w:val="0"/>
+          <w:sz w:val="20"/>
+        </w:rPr>
+        <w:t>Fonte: Elaborado pelos autores (2026).</w:t>
+      </w:r>
+    </w:p>
+    <w:p>
+      <w:pPr>
+        <w:spacing w:before="120" w:after="40"/>
+        <w:jc w:val="left"/>
+      </w:pPr>
+      <w:r>
+        <w:rPr>
+          <w:rFonts w:ascii="Times New Roman" w:hAnsi="Times New Roman"/>
+          <w:b/>
+          <w:i w:val="0"/>
+          <w:sz w:val="24"/>
+        </w:rPr>
+        <w:t>4.6 Comportamento individual entre atletas</w:t>
+      </w:r>
+    </w:p>
+    <w:p>
+      <w:pPr>
+        <w:spacing w:line="360" w:lineRule="auto"/>
+        <w:ind w:firstLine="709"/>
+        <w:jc w:val="both"/>
+      </w:pPr>
+      <w:r>
+        <w:rPr>
+          <w:rFonts w:ascii="Times New Roman" w:hAnsi="Times New Roman"/>
+          <w:b w:val="0"/>
+          <w:i w:val="0"/>
+          <w:sz w:val="24"/>
+        </w:rPr>
+        <w:t>No nível individual, a heterogeneidade é marcante. O mapa de calor da amplitude por atleta (Figura 3) já mostrara que alguns atletas oscilam pouco e outros amplificam em todas as variáveis. As trajetórias individuais ao longo da semana (Figura 6) confirmam que, embora a direção do declínio do vigor e da elevação da fadiga física seja compartilhada pela maioria, a magnitude e o ponto de partida variam substancialmente entre atletas, de modo que escores idênticos podem representar estados distintos conforme a referência individual. A resposta aguda pré→pós por atleta (Figura 7) reproduz esse quadro no nível intradiário: a maioria reduz o vigor e aumenta a fadiga física, mas em amplitudes heterogêneas. Em conjunto, esses achados desaconselham o uso de pontos de corte normativos únicos e sustentam o referenciamento de cada atleta à sua própria linha de base.</w:t>
+      </w:r>
+    </w:p>
+    <w:p>
+      <w:pPr>
+        <w:spacing w:before="120" w:line="240" w:lineRule="auto"/>
+        <w:jc w:val="center"/>
+      </w:pPr>
+      <w:r>
+        <w:rPr>
+          <w:rFonts w:ascii="Times New Roman" w:hAnsi="Times New Roman"/>
+          <w:b w:val="0"/>
+          <w:i w:val="0"/>
+          <w:sz w:val="20"/>
+        </w:rPr>
+        <w:t>Figura 6 – Trajetórias individuais do vigor e da fadiga física ao longo da semana (linha em destaque = média do grupo)</w:t>
       </w:r>
     </w:p>
     <w:p>
@@ -3354,7 +3454,7 @@
         <w:drawing>
           <wp:inline xmlns:a="http://schemas.openxmlformats.org/drawingml/2006/main" xmlns:pic="http://schemas.openxmlformats.org/drawingml/2006/picture">
             <wp:extent cx="4937760" cy="2777490"/>
-            <wp:docPr id="11" name="Picture 11"/>
+            <wp:docPr id="12" name="Picture 12"/>
             <wp:cNvGraphicFramePr>
               <a:graphicFrameLocks noChangeAspect="1"/>
             </wp:cNvGraphicFramePr>
@@ -3366,7 +3466,7 @@
                     <pic:cNvPicPr/>
                   </pic:nvPicPr>
                   <pic:blipFill>
-                    <a:blip r:embed="rId19"/>
+                    <a:blip r:embed="rId20"/>
                     <a:stretch>
                       <a:fillRect/>
                     </a:stretch>
@@ -3412,7 +3512,7 @@
           <w:i w:val="0"/>
           <w:sz w:val="20"/>
         </w:rPr>
-        <w:t>Figura 6 – Velocidade (linha cheia) e aceleração (tracejada) da trajetória de cada variável; linha vertical = ponto de inflexão</w:t>
+        <w:t>Figura 7 – Resposta individual pré→pós na semana (cada linha = um atleta; linha em destaque = média do grupo)</w:t>
       </w:r>
     </w:p>
     <w:p>
@@ -3422,8 +3522,8 @@
       <w:r>
         <w:drawing>
           <wp:inline xmlns:a="http://schemas.openxmlformats.org/drawingml/2006/main" xmlns:pic="http://schemas.openxmlformats.org/drawingml/2006/picture">
-            <wp:extent cx="4572000" cy="2571750"/>
-            <wp:docPr id="12" name="Picture 12"/>
+            <wp:extent cx="4937760" cy="2798064"/>
+            <wp:docPr id="13" name="Picture 13"/>
             <wp:cNvGraphicFramePr>
               <a:graphicFrameLocks noChangeAspect="1"/>
             </wp:cNvGraphicFramePr>
@@ -3431,11 +3531,11 @@
               <a:graphicData uri="http://schemas.openxmlformats.org/drawingml/2006/picture">
                 <pic:pic>
                   <pic:nvPicPr>
-                    <pic:cNvPr id="0" name="sem_f_derivadas.png"/>
+                    <pic:cNvPr id="0" name="sem_f_ind_prepos.png"/>
                     <pic:cNvPicPr/>
                   </pic:nvPicPr>
                   <pic:blipFill>
-                    <a:blip r:embed="rId20"/>
+                    <a:blip r:embed="rId21"/>
                     <a:stretch>
                       <a:fillRect/>
                     </a:stretch>
@@ -3443,7 +3543,7 @@
                   <pic:spPr>
                     <a:xfrm>
                       <a:off x="0" y="0"/>
-                      <a:ext cx="4572000" cy="2571750"/>
+                      <a:ext cx="4937760" cy="2798064"/>
                     </a:xfrm>
                     <a:prstGeom prst="rect"/>
                   </pic:spPr>

</xml_diff>